<commit_message>
Publica web (dl. 28/09/2026 17:52:38,89)
</commit_message>
<xml_diff>
--- a/public/docs/sa1-guia-docent.docx
+++ b/public/docs/sa1-guia-docent.docx
@@ -1827,7 +1827,7 @@
                 <w:sz w:val="20"/>
                 <w:szCs w:val="20"/>
               </w:rPr>
-              <w:t xml:space="preserve">Formulari d'osmosi + entrega dels nivells d'organització</w:t>
+              <w:t xml:space="preserve">Exit tiquet en paper + formulari d'osmosi a Classroom (repàs) + entrega de la maqueta dels nivells d'organització</w:t>
             </w:r>
           </w:p>
         </w:tc>
@@ -7158,7 +7158,7 @@
           <w:sz w:val="21"/>
           <w:szCs w:val="21"/>
         </w:rPr>
-        <w:t xml:space="preserve">Predir i comprovar què li passa a l'ou en cada medi i relacionar-ho amb l'osmosi.</w:t>
+        <w:t xml:space="preserve">Pesar l'ou abans i després i calcular la diferència de massa (massa final − massa inicial), amb el signe.</w:t>
       </w:r>
     </w:p>
     <w:p>
@@ -7193,7 +7193,42 @@
           <w:sz w:val="21"/>
           <w:szCs w:val="21"/>
         </w:rPr>
-        <w:t xml:space="preserve">Descriure la membrana com la frontera que regula què entra i què surt.</w:t>
+        <w:t xml:space="preserve">Explicar amb els termes osmosi i membrana semipermeable per què l'ou guanya o perd aigua.</w:t>
+      </w:r>
+    </w:p>
+    <w:p>
+      <w:pPr>
+        <w:spacing w:after="60" w:before="0" w:line="264"/>
+        <w:ind w:left="200" w:hanging="200"/>
+        <w:jc w:val="left"/>
+      </w:pPr>
+      <w:r>
+        <w:rPr>
+          <w:rFonts w:ascii="Fira Sans Extra Condensed" w:cs="Fira Sans Extra Condensed" w:eastAsia="Fira Sans Extra Condensed" w:hAnsi="Fira Sans Extra Condensed"/>
+          <w:b/>
+          <w:bCs/>
+          <w:i w:val="false"/>
+          <w:iCs w:val="false"/>
+          <w:caps w:val="false"/>
+          <w:color w:val="7B68C8"/>
+          <w:sz w:val="21"/>
+          <w:szCs w:val="21"/>
+        </w:rPr>
+        <w:t xml:space="preserve">• </w:t>
+      </w:r>
+      <w:r>
+        <w:rPr>
+          <w:rFonts w:ascii="Fira Sans Extra Condensed" w:cs="Fira Sans Extra Condensed" w:eastAsia="Fira Sans Extra Condensed" w:hAnsi="Fira Sans Extra Condensed"/>
+          <w:b w:val="false"/>
+          <w:bCs w:val="false"/>
+          <w:i w:val="false"/>
+          <w:iCs w:val="false"/>
+          <w:caps w:val="false"/>
+          <w:color w:val="4A3F3F"/>
+          <w:sz w:val="21"/>
+          <w:szCs w:val="21"/>
+        </w:rPr>
+        <w:t xml:space="preserve">Justificar per què el vinagre és el control i per què calen les dades de tota la classe.</w:t>
       </w:r>
     </w:p>
     <w:p>
@@ -7325,7 +7360,7 @@
           <w:sz w:val="21"/>
           <w:szCs w:val="21"/>
         </w:rPr>
-        <w:t xml:space="preserve">Preparar dos gots etiquetats per grup: </w:t>
+        <w:t xml:space="preserve">Preparar </w:t>
       </w:r>
       <w:r>
         <w:rPr>
@@ -7339,7 +7374,7 @@
           <w:sz w:val="21"/>
           <w:szCs w:val="21"/>
         </w:rPr>
-        <w:t xml:space="preserve">aigua pura</w:t>
+        <w:t xml:space="preserve">tres gots etiquetats per grup</w:t>
       </w:r>
       <w:r>
         <w:rPr>
@@ -7353,7 +7388,7 @@
           <w:sz w:val="21"/>
           <w:szCs w:val="21"/>
         </w:rPr>
-        <w:t xml:space="preserve"> i </w:t>
+        <w:t xml:space="preserve"> de tres alumnes: </w:t>
       </w:r>
       <w:r>
         <w:rPr>
@@ -7367,7 +7402,7 @@
           <w:sz w:val="21"/>
           <w:szCs w:val="21"/>
         </w:rPr>
-        <w:t xml:space="preserve">aigua molt salada</w:t>
+        <w:t xml:space="preserve">aigua destil·lada</w:t>
       </w:r>
       <w:r>
         <w:rPr>
@@ -7381,7 +7416,63 @@
           <w:sz w:val="21"/>
           <w:szCs w:val="21"/>
         </w:rPr>
-        <w:t xml:space="preserve"> (una cullerada sopera de sal per got, ben remenada). Si sobra algun ou, deixar-lo sense submergir com a </w:t>
+        <w:t xml:space="preserve">, </w:t>
+      </w:r>
+      <w:r>
+        <w:rPr>
+          <w:rFonts w:ascii="Fira Sans Extra Condensed" w:cs="Fira Sans Extra Condensed" w:eastAsia="Fira Sans Extra Condensed" w:hAnsi="Fira Sans Extra Condensed"/>
+          <w:b/>
+          <w:bCs/>
+          <w:i w:val="false"/>
+          <w:iCs w:val="false"/>
+          <w:caps w:val="false"/>
+          <w:color w:val="4A3F3F"/>
+          <w:sz w:val="21"/>
+          <w:szCs w:val="21"/>
+        </w:rPr>
+        <w:t xml:space="preserve">aigua amb molta sal</w:t>
+      </w:r>
+      <w:r>
+        <w:rPr>
+          <w:rFonts w:ascii="Fira Sans Extra Condensed" w:cs="Fira Sans Extra Condensed" w:eastAsia="Fira Sans Extra Condensed" w:hAnsi="Fira Sans Extra Condensed"/>
+          <w:b w:val="false"/>
+          <w:bCs w:val="false"/>
+          <w:i w:val="false"/>
+          <w:iCs w:val="false"/>
+          <w:caps w:val="false"/>
+          <w:color w:val="4A3F3F"/>
+          <w:sz w:val="21"/>
+          <w:szCs w:val="21"/>
+        </w:rPr>
+        <w:t xml:space="preserve"> (una cullerada sopera de sal per got, ben remenada) i </w:t>
+      </w:r>
+      <w:r>
+        <w:rPr>
+          <w:rFonts w:ascii="Fira Sans Extra Condensed" w:cs="Fira Sans Extra Condensed" w:eastAsia="Fira Sans Extra Condensed" w:hAnsi="Fira Sans Extra Condensed"/>
+          <w:b/>
+          <w:bCs/>
+          <w:i w:val="false"/>
+          <w:iCs w:val="false"/>
+          <w:caps w:val="false"/>
+          <w:color w:val="4A3F3F"/>
+          <w:sz w:val="21"/>
+          <w:szCs w:val="21"/>
+        </w:rPr>
+        <w:t xml:space="preserve">vinagre</w:t>
+      </w:r>
+      <w:r>
+        <w:rPr>
+          <w:rFonts w:ascii="Fira Sans Extra Condensed" w:cs="Fira Sans Extra Condensed" w:eastAsia="Fira Sans Extra Condensed" w:hAnsi="Fira Sans Extra Condensed"/>
+          <w:b w:val="false"/>
+          <w:bCs w:val="false"/>
+          <w:i w:val="false"/>
+          <w:iCs w:val="false"/>
+          <w:caps w:val="false"/>
+          <w:color w:val="4A3F3F"/>
+          <w:sz w:val="21"/>
+          <w:szCs w:val="21"/>
+        </w:rPr>
+        <w:t xml:space="preserve">, que és el </w:t>
       </w:r>
       <w:r>
         <w:rPr>
@@ -7444,7 +7535,35 @@
           <w:sz w:val="21"/>
           <w:szCs w:val="21"/>
         </w:rPr>
-        <w:t xml:space="preserve">Una balança de cuina o un regle per grup.</w:t>
+        <w:t xml:space="preserve">Una </w:t>
+      </w:r>
+      <w:r>
+        <w:rPr>
+          <w:rFonts w:ascii="Fira Sans Extra Condensed" w:cs="Fira Sans Extra Condensed" w:eastAsia="Fira Sans Extra Condensed" w:hAnsi="Fira Sans Extra Condensed"/>
+          <w:b/>
+          <w:bCs/>
+          <w:i w:val="false"/>
+          <w:iCs w:val="false"/>
+          <w:caps w:val="false"/>
+          <w:color w:val="4A3F3F"/>
+          <w:sz w:val="21"/>
+          <w:szCs w:val="21"/>
+        </w:rPr>
+        <w:t xml:space="preserve">balança</w:t>
+      </w:r>
+      <w:r>
+        <w:rPr>
+          <w:rFonts w:ascii="Fira Sans Extra Condensed" w:cs="Fira Sans Extra Condensed" w:eastAsia="Fira Sans Extra Condensed" w:hAnsi="Fira Sans Extra Condensed"/>
+          <w:b w:val="false"/>
+          <w:bCs w:val="false"/>
+          <w:i w:val="false"/>
+          <w:iCs w:val="false"/>
+          <w:caps w:val="false"/>
+          <w:color w:val="4A3F3F"/>
+          <w:sz w:val="21"/>
+          <w:szCs w:val="21"/>
+        </w:rPr>
+        <w:t xml:space="preserve"> (millor de 0,1 g) i paper de cuina per grup.</w:t>
       </w:r>
     </w:p>
     <w:p>
@@ -7479,7 +7598,35 @@
           <w:sz w:val="21"/>
           <w:szCs w:val="21"/>
         </w:rPr>
-        <w:t xml:space="preserve">Dos o tres ous de reserva ja descalcificats pel professorat: sempre hi ha algun ou que no ha quedat bé.</w:t>
+        <w:t xml:space="preserve">Dos o tres </w:t>
+      </w:r>
+      <w:r>
+        <w:rPr>
+          <w:rFonts w:ascii="Fira Sans Extra Condensed" w:cs="Fira Sans Extra Condensed" w:eastAsia="Fira Sans Extra Condensed" w:hAnsi="Fira Sans Extra Condensed"/>
+          <w:b/>
+          <w:bCs/>
+          <w:i w:val="false"/>
+          <w:iCs w:val="false"/>
+          <w:caps w:val="false"/>
+          <w:color w:val="4A3F3F"/>
+          <w:sz w:val="21"/>
+          <w:szCs w:val="21"/>
+        </w:rPr>
+        <w:t xml:space="preserve">ous de reserva</w:t>
+      </w:r>
+      <w:r>
+        <w:rPr>
+          <w:rFonts w:ascii="Fira Sans Extra Condensed" w:cs="Fira Sans Extra Condensed" w:eastAsia="Fira Sans Extra Condensed" w:hAnsi="Fira Sans Extra Condensed"/>
+          <w:b w:val="false"/>
+          <w:bCs w:val="false"/>
+          <w:i w:val="false"/>
+          <w:iCs w:val="false"/>
+          <w:caps w:val="false"/>
+          <w:color w:val="4A3F3F"/>
+          <w:sz w:val="21"/>
+          <w:szCs w:val="21"/>
+        </w:rPr>
+        <w:t xml:space="preserve"> ja descalcificats pel professorat: sempre hi ha algun ou que no ha quedat bé o algú que no el porta.</w:t>
       </w:r>
     </w:p>
     <w:p>
@@ -7514,7 +7661,7 @@
           <w:sz w:val="21"/>
           <w:szCs w:val="21"/>
         </w:rPr>
-        <w:t xml:space="preserve">Ordre imprescindible: </w:t>
+        <w:t xml:space="preserve">Ous testimoni:</w:t>
       </w:r>
       <w:r>
         <w:rPr>
@@ -7528,7 +7675,7 @@
           <w:sz w:val="21"/>
           <w:szCs w:val="21"/>
         </w:rPr>
-        <w:t xml:space="preserve">primer es revisa i es mesura l'ou, i només després s'obre l'aplicació d'osmosi mentre s'espera. Mai a l'inrevés.</w:t>
+        <w:t xml:space="preserve"> a primera hora, submergir un joc de tres ous de reserva als tres gots. Els ous de l'alumnat només tenen uns 40 minuts d'espera; si canvien poc, els ous testimoni (més estona en remull) mostren el canvi clarament a l'Elaborate.</w:t>
       </w:r>
     </w:p>
     <w:p>
@@ -7563,7 +7710,7 @@
           <w:sz w:val="21"/>
           <w:szCs w:val="21"/>
         </w:rPr>
-        <w:t xml:space="preserve">Comprovar l'aplicació d'osmosi a la pàgina de la sessió 2.</w:t>
+        <w:t xml:space="preserve">Comprovar a la pàgina de la sessió 2 l'aplicació d'osmosi (apartat 2) i el laboratori virtual de l'ou (botó «No has portat l'ou? Fes l'experiment virtual», apartat 3).</w:t>
       </w:r>
     </w:p>
     <w:p>
@@ -7598,7 +7745,7 @@
           <w:sz w:val="21"/>
           <w:szCs w:val="21"/>
         </w:rPr>
-        <w:t xml:space="preserve">Tot el resultat es llegeix </w:t>
+        <w:t xml:space="preserve">Calendari que no es pot moure: tots els ous submergits </w:t>
       </w:r>
       <w:r>
         <w:rPr>
@@ -7612,7 +7759,7 @@
           <w:sz w:val="21"/>
           <w:szCs w:val="21"/>
         </w:rPr>
-        <w:t xml:space="preserve">dins d'aquesta sessió</w:t>
+        <w:t xml:space="preserve">abans del minut 30</w:t>
       </w:r>
       <w:r>
         <w:rPr>
@@ -7626,7 +7773,35 @@
           <w:sz w:val="21"/>
           <w:szCs w:val="21"/>
         </w:rPr>
-        <w:t xml:space="preserve">: els ous han d'estar submergits abans del minut 45 perquè el canvi sigui visible al final.</w:t>
+        <w:t xml:space="preserve">; es treuen i es pesen </w:t>
+      </w:r>
+      <w:r>
+        <w:rPr>
+          <w:rFonts w:ascii="Fira Sans Extra Condensed" w:cs="Fira Sans Extra Condensed" w:eastAsia="Fira Sans Extra Condensed" w:hAnsi="Fira Sans Extra Condensed"/>
+          <w:b/>
+          <w:bCs/>
+          <w:i w:val="false"/>
+          <w:iCs w:val="false"/>
+          <w:caps w:val="false"/>
+          <w:color w:val="4A3F3F"/>
+          <w:sz w:val="21"/>
+          <w:szCs w:val="21"/>
+        </w:rPr>
+        <w:t xml:space="preserve">a partir del minut 65</w:t>
+      </w:r>
+      <w:r>
+        <w:rPr>
+          <w:rFonts w:ascii="Fira Sans Extra Condensed" w:cs="Fira Sans Extra Condensed" w:eastAsia="Fira Sans Extra Condensed" w:hAnsi="Fira Sans Extra Condensed"/>
+          <w:b w:val="false"/>
+          <w:bCs w:val="false"/>
+          <w:i w:val="false"/>
+          <w:iCs w:val="false"/>
+          <w:caps w:val="false"/>
+          <w:color w:val="4A3F3F"/>
+          <w:sz w:val="21"/>
+          <w:szCs w:val="21"/>
+        </w:rPr>
+        <w:t xml:space="preserve">.</w:t>
       </w:r>
     </w:p>
     <w:p>
@@ -7661,7 +7836,42 @@
           <w:sz w:val="21"/>
           <w:szCs w:val="21"/>
         </w:rPr>
-        <w:t xml:space="preserve">Preparar un lloc per recollir les representacions dels nivells d'organització.</w:t>
+        <w:t xml:space="preserve">Imprimir l'exit tiquet, que va en un full a part (versió estàndard i versió C).</w:t>
+      </w:r>
+    </w:p>
+    <w:p>
+      <w:pPr>
+        <w:spacing w:after="60" w:before="0" w:line="264"/>
+        <w:ind w:left="260" w:hanging="260"/>
+        <w:jc w:val="left"/>
+      </w:pPr>
+      <w:r>
+        <w:rPr>
+          <w:rFonts w:ascii="Fira Sans Extra Condensed" w:cs="Fira Sans Extra Condensed" w:eastAsia="Fira Sans Extra Condensed" w:hAnsi="Fira Sans Extra Condensed"/>
+          <w:b/>
+          <w:bCs/>
+          <w:i w:val="false"/>
+          <w:iCs w:val="false"/>
+          <w:caps w:val="false"/>
+          <w:color w:val="7B68C8"/>
+          <w:sz w:val="21"/>
+          <w:szCs w:val="21"/>
+        </w:rPr>
+        <w:t xml:space="preserve">8 </w:t>
+      </w:r>
+      <w:r>
+        <w:rPr>
+          <w:rFonts w:ascii="Fira Sans Extra Condensed" w:cs="Fira Sans Extra Condensed" w:eastAsia="Fira Sans Extra Condensed" w:hAnsi="Fira Sans Extra Condensed"/>
+          <w:b w:val="false"/>
+          <w:bCs w:val="false"/>
+          <w:i w:val="false"/>
+          <w:iCs w:val="false"/>
+          <w:caps w:val="false"/>
+          <w:color w:val="4A3F3F"/>
+          <w:sz w:val="21"/>
+          <w:szCs w:val="21"/>
+        </w:rPr>
+        <w:t xml:space="preserve">Preparar un lloc per recollir les maquetes dels nivells d'organització.</w:t>
       </w:r>
     </w:p>
     <w:p>
@@ -7976,76 +8186,23 @@
                 <w:sz w:val="20"/>
                 <w:szCs w:val="20"/>
               </w:rPr>
-              <w:t xml:space="preserve">Ganxo en directe: </w:t>
-            </w:r>
-            <w:r>
-              <w:rPr>
-                <w:rFonts w:ascii="Fira Sans Extra Condensed" w:cs="Fira Sans Extra Condensed" w:eastAsia="Fira Sans Extra Condensed" w:hAnsi="Fira Sans Extra Condensed"/>
-                <w:b w:val="false"/>
-                <w:bCs w:val="false"/>
-                <w:i w:val="false"/>
-                <w:iCs w:val="false"/>
-                <w:caps w:val="false"/>
-                <w:color w:val="4A3F3F"/>
-                <w:sz w:val="20"/>
-                <w:szCs w:val="20"/>
-              </w:rPr>
-              <w:t xml:space="preserve">ensenyar a la mà un ou sense closca (tou, translúcid) al costat d'un ós de gominola que ha passat la nit en aigua i un de sec. «Què els ha passat? Per què un s'ha inflat?».</w:t>
-            </w:r>
-          </w:p>
-          <w:p>
-            <w:pPr>
-              <w:spacing w:after="0" w:before="0" w:line="264"/>
-              <w:ind w:left="200" w:hanging="200"/>
-              <w:jc w:val="left"/>
-            </w:pPr>
-            <w:r>
-              <w:rPr>
-                <w:rFonts w:ascii="Fira Sans Extra Condensed" w:cs="Fira Sans Extra Condensed" w:eastAsia="Fira Sans Extra Condensed" w:hAnsi="Fira Sans Extra Condensed"/>
-                <w:b/>
-                <w:bCs/>
-                <w:i w:val="false"/>
-                <w:iCs w:val="false"/>
-                <w:caps w:val="false"/>
-                <w:color w:val="7B68C8"/>
-                <w:sz w:val="20"/>
-                <w:szCs w:val="20"/>
-              </w:rPr>
-              <w:t xml:space="preserve">• </w:t>
-            </w:r>
-            <w:r>
-              <w:rPr>
-                <w:rFonts w:ascii="Fira Sans Extra Condensed" w:cs="Fira Sans Extra Condensed" w:eastAsia="Fira Sans Extra Condensed" w:hAnsi="Fira Sans Extra Condensed"/>
-                <w:b w:val="false"/>
-                <w:bCs w:val="false"/>
-                <w:i w:val="false"/>
-                <w:iCs w:val="false"/>
-                <w:caps w:val="false"/>
-                <w:color w:val="4A3F3F"/>
-                <w:sz w:val="20"/>
-                <w:szCs w:val="20"/>
-              </w:rPr>
-              <w:t xml:space="preserve">Llançar la pregunta motriu i demanar predicció escrita individual a l'apartat 0 de la fitxa. No revelar res.</w:t>
-            </w:r>
-          </w:p>
-        </w:tc>
-        <w:tc>
-          <w:tcPr>
-            <w:tcW w:type="dxa" w:w="3466"/>
-            <w:tcBorders>
-              <w:top w:val="single" w:color="EAE6F6" w:sz="4"/>
-              <w:left w:val="single" w:color="EAE6F6" w:sz="4"/>
-              <w:bottom w:val="single" w:color="EAE6F6" w:sz="4"/>
-              <w:right w:val="single" w:color="EAE6F6" w:sz="4"/>
-            </w:tcBorders>
-            <w:tcMar>
-              <w:top w:type="dxa" w:w="100"/>
-              <w:left w:type="dxa" w:w="120"/>
-              <w:bottom w:type="dxa" w:w="100"/>
-              <w:right w:type="dxa" w:w="120"/>
-            </w:tcMar>
-            <w:vAlign w:val="top"/>
-          </w:tcPr>
+              <w:t xml:space="preserve">Ganxo en directe:</w:t>
+            </w:r>
+            <w:r>
+              <w:rPr>
+                <w:rFonts w:ascii="Fira Sans Extra Condensed" w:cs="Fira Sans Extra Condensed" w:eastAsia="Fira Sans Extra Condensed" w:hAnsi="Fira Sans Extra Condensed"/>
+                <w:b w:val="false"/>
+                <w:bCs w:val="false"/>
+                <w:i w:val="false"/>
+                <w:iCs w:val="false"/>
+                <w:caps w:val="false"/>
+                <w:color w:val="4A3F3F"/>
+                <w:sz w:val="20"/>
+                <w:szCs w:val="20"/>
+              </w:rPr>
+              <w:t xml:space="preserve"> ensenyar a la mà un ou sense closca (tou, translúcid) al costat d'un ós de gominola que ha passat la nit en aigua i un de sec. «Què els ha passat? Per què un s'ha inflat?».</w:t>
+            </w:r>
+          </w:p>
           <w:p>
             <w:pPr>
               <w:spacing w:after="60" w:before="0" w:line="264"/>
@@ -8078,12 +8235,93 @@
                 <w:sz w:val="20"/>
                 <w:szCs w:val="20"/>
               </w:rPr>
+              <w:t xml:space="preserve">Llançar la pregunta motriu i demanar una </w:t>
+            </w:r>
+            <w:r>
+              <w:rPr>
+                <w:rFonts w:ascii="Fira Sans Extra Condensed" w:cs="Fira Sans Extra Condensed" w:eastAsia="Fira Sans Extra Condensed" w:hAnsi="Fira Sans Extra Condensed"/>
+                <w:b/>
+                <w:bCs/>
+                <w:i w:val="false"/>
+                <w:iCs w:val="false"/>
+                <w:caps w:val="false"/>
+                <w:color w:val="4A3F3F"/>
+                <w:sz w:val="20"/>
+                <w:szCs w:val="20"/>
+              </w:rPr>
+              <w:t xml:space="preserve">predicció escrita individual</w:t>
+            </w:r>
+            <w:r>
+              <w:rPr>
+                <w:rFonts w:ascii="Fira Sans Extra Condensed" w:cs="Fira Sans Extra Condensed" w:eastAsia="Fira Sans Extra Condensed" w:hAnsi="Fira Sans Extra Condensed"/>
+                <w:b w:val="false"/>
+                <w:bCs w:val="false"/>
+                <w:i w:val="false"/>
+                <w:iCs w:val="false"/>
+                <w:caps w:val="false"/>
+                <w:color w:val="4A3F3F"/>
+                <w:sz w:val="20"/>
+                <w:szCs w:val="20"/>
+              </w:rPr>
+              <w:t xml:space="preserve"> a l'apartat 0 de la fitxa. No es corregeix ni es revela res: es comprovarà a l'Elaborate.</w:t>
+            </w:r>
+          </w:p>
+        </w:tc>
+        <w:tc>
+          <w:tcPr>
+            <w:tcW w:type="dxa" w:w="3466"/>
+            <w:tcBorders>
+              <w:top w:val="single" w:color="EAE6F6" w:sz="4"/>
+              <w:left w:val="single" w:color="EAE6F6" w:sz="4"/>
+              <w:bottom w:val="single" w:color="EAE6F6" w:sz="4"/>
+              <w:right w:val="single" w:color="EAE6F6" w:sz="4"/>
+            </w:tcBorders>
+            <w:tcMar>
+              <w:top w:type="dxa" w:w="100"/>
+              <w:left w:type="dxa" w:w="120"/>
+              <w:bottom w:type="dxa" w:w="100"/>
+              <w:right w:type="dxa" w:w="120"/>
+            </w:tcMar>
+            <w:vAlign w:val="top"/>
+          </w:tcPr>
+          <w:p>
+            <w:pPr>
+              <w:spacing w:after="60" w:before="0" w:line="264"/>
+              <w:ind w:left="200" w:hanging="200"/>
+              <w:jc w:val="left"/>
+            </w:pPr>
+            <w:r>
+              <w:rPr>
+                <w:rFonts w:ascii="Fira Sans Extra Condensed" w:cs="Fira Sans Extra Condensed" w:eastAsia="Fira Sans Extra Condensed" w:hAnsi="Fira Sans Extra Condensed"/>
+                <w:b/>
+                <w:bCs/>
+                <w:i w:val="false"/>
+                <w:iCs w:val="false"/>
+                <w:caps w:val="false"/>
+                <w:color w:val="7B68C8"/>
+                <w:sz w:val="20"/>
+                <w:szCs w:val="20"/>
+              </w:rPr>
+              <w:t xml:space="preserve">• </w:t>
+            </w:r>
+            <w:r>
+              <w:rPr>
+                <w:rFonts w:ascii="Fira Sans Extra Condensed" w:cs="Fira Sans Extra Condensed" w:eastAsia="Fira Sans Extra Condensed" w:hAnsi="Fira Sans Extra Condensed"/>
+                <w:b w:val="false"/>
+                <w:bCs w:val="false"/>
+                <w:i w:val="false"/>
+                <w:iCs w:val="false"/>
+                <w:caps w:val="false"/>
+                <w:color w:val="4A3F3F"/>
+                <w:sz w:val="20"/>
+                <w:szCs w:val="20"/>
+              </w:rPr>
               <w:t xml:space="preserve">Comparen la gominola inflada i la seca i fan hipòtesis.</w:t>
             </w:r>
           </w:p>
           <w:p>
             <w:pPr>
-              <w:spacing w:after="0" w:before="0" w:line="264"/>
+              <w:spacing w:after="60" w:before="0" w:line="264"/>
               <w:ind w:left="200" w:hanging="200"/>
               <w:jc w:val="left"/>
             </w:pPr>
@@ -8113,7 +8351,7 @@
                 <w:sz w:val="20"/>
                 <w:szCs w:val="20"/>
               </w:rPr>
-              <w:t xml:space="preserve">Escriuen la seva predicció per als dos medis abans de tocar res.</w:t>
+              <w:t xml:space="preserve">Escriuen la seva predicció per als tres gots abans de tocar res.</w:t>
             </w:r>
           </w:p>
         </w:tc>
@@ -8177,7 +8415,7 @@
                 <w:sz w:val="19"/>
                 <w:szCs w:val="19"/>
               </w:rPr>
-              <w:t xml:space="preserve">35 min</w:t>
+              <w:t xml:space="preserve">25 min</w:t>
             </w:r>
           </w:p>
         </w:tc>
@@ -8231,7 +8469,7 @@
                 <w:sz w:val="20"/>
                 <w:szCs w:val="20"/>
               </w:rPr>
-              <w:t xml:space="preserve">Revisar l'ou de cada grup (mida, color, fermesa) i repartir els ous de reserva a qui no en tingui de vàlid.</w:t>
+              <w:t xml:space="preserve">Formar grups de tres (un ou per got) i repartir els ous de reserva a qui no en tingui de vàlid.</w:t>
             </w:r>
           </w:p>
           <w:p>
@@ -8266,35 +8504,35 @@
                 <w:sz w:val="20"/>
                 <w:szCs w:val="20"/>
               </w:rPr>
-              <w:t xml:space="preserve">Repartir els gots i exigir la </w:t>
-            </w:r>
-            <w:r>
-              <w:rPr>
-                <w:rFonts w:ascii="Fira Sans Extra Condensed" w:cs="Fira Sans Extra Condensed" w:eastAsia="Fira Sans Extra Condensed" w:hAnsi="Fira Sans Extra Condensed"/>
-                <w:b/>
-                <w:bCs/>
-                <w:i w:val="false"/>
-                <w:iCs w:val="false"/>
-                <w:caps w:val="false"/>
-                <w:color w:val="4A3F3F"/>
-                <w:sz w:val="20"/>
-                <w:szCs w:val="20"/>
-              </w:rPr>
-              <w:t xml:space="preserve">mesura inicial</w:t>
-            </w:r>
-            <w:r>
-              <w:rPr>
-                <w:rFonts w:ascii="Fira Sans Extra Condensed" w:cs="Fira Sans Extra Condensed" w:eastAsia="Fira Sans Extra Condensed" w:hAnsi="Fira Sans Extra Condensed"/>
-                <w:b w:val="false"/>
-                <w:bCs w:val="false"/>
-                <w:i w:val="false"/>
-                <w:iCs w:val="false"/>
-                <w:caps w:val="false"/>
-                <w:color w:val="4A3F3F"/>
-                <w:sz w:val="20"/>
-                <w:szCs w:val="20"/>
-              </w:rPr>
-              <w:t xml:space="preserve"> —pes o diàmetre— abans de submergir. Sense el «abans» no hi ha res a demostrar.</w:t>
+              <w:t xml:space="preserve">Exigir la </w:t>
+            </w:r>
+            <w:r>
+              <w:rPr>
+                <w:rFonts w:ascii="Fira Sans Extra Condensed" w:cs="Fira Sans Extra Condensed" w:eastAsia="Fira Sans Extra Condensed" w:hAnsi="Fira Sans Extra Condensed"/>
+                <w:b/>
+                <w:bCs/>
+                <w:i w:val="false"/>
+                <w:iCs w:val="false"/>
+                <w:caps w:val="false"/>
+                <w:color w:val="4A3F3F"/>
+                <w:sz w:val="20"/>
+                <w:szCs w:val="20"/>
+              </w:rPr>
+              <w:t xml:space="preserve">massa inicial</w:t>
+            </w:r>
+            <w:r>
+              <w:rPr>
+                <w:rFonts w:ascii="Fira Sans Extra Condensed" w:cs="Fira Sans Extra Condensed" w:eastAsia="Fira Sans Extra Condensed" w:hAnsi="Fira Sans Extra Condensed"/>
+                <w:b w:val="false"/>
+                <w:bCs w:val="false"/>
+                <w:i w:val="false"/>
+                <w:iCs w:val="false"/>
+                <w:caps w:val="false"/>
+                <w:color w:val="4A3F3F"/>
+                <w:sz w:val="20"/>
+                <w:szCs w:val="20"/>
+              </w:rPr>
+              <w:t xml:space="preserve"> abans de submergir: sense el «abans» no hi ha res a demostrar.</w:t>
             </w:r>
           </w:p>
           <w:p>
@@ -8329,63 +8567,9 @@
                 <w:sz w:val="20"/>
                 <w:szCs w:val="20"/>
               </w:rPr>
-              <w:t xml:space="preserve">Un cop tots els ous són dins, obrir l'aplicació d'osmosi de manera guiada, amb pregunta prèvia: «cap a on creieu que anirà l'aigua i per què?». Mateixa lògica que a la S1: mai exploració lliure.</w:t>
-            </w:r>
-          </w:p>
-          <w:p>
-            <w:pPr>
-              <w:spacing w:after="0" w:before="0" w:line="264"/>
-              <w:ind w:left="200" w:hanging="200"/>
-              <w:jc w:val="left"/>
-            </w:pPr>
-            <w:r>
-              <w:rPr>
-                <w:rFonts w:ascii="Fira Sans Extra Condensed" w:cs="Fira Sans Extra Condensed" w:eastAsia="Fira Sans Extra Condensed" w:hAnsi="Fira Sans Extra Condensed"/>
-                <w:b/>
-                <w:bCs/>
-                <w:i w:val="false"/>
-                <w:iCs w:val="false"/>
-                <w:caps w:val="false"/>
-                <w:color w:val="7B68C8"/>
-                <w:sz w:val="20"/>
-                <w:szCs w:val="20"/>
-              </w:rPr>
-              <w:t xml:space="preserve">• </w:t>
-            </w:r>
-            <w:r>
-              <w:rPr>
-                <w:rFonts w:ascii="Fira Sans Extra Condensed" w:cs="Fira Sans Extra Condensed" w:eastAsia="Fira Sans Extra Condensed" w:hAnsi="Fira Sans Extra Condensed"/>
-                <w:b w:val="false"/>
-                <w:bCs w:val="false"/>
-                <w:i w:val="false"/>
-                <w:iCs w:val="false"/>
-                <w:caps w:val="false"/>
-                <w:color w:val="4A3F3F"/>
-                <w:sz w:val="20"/>
-                <w:szCs w:val="20"/>
-              </w:rPr>
-              <w:t xml:space="preserve">Llançar el moment epistèmic mentre s'espera.</w:t>
-            </w:r>
-          </w:p>
-        </w:tc>
-        <w:tc>
-          <w:tcPr>
-            <w:tcW w:type="dxa" w:w="3466"/>
-            <w:tcBorders>
-              <w:top w:val="single" w:color="EAE6F6" w:sz="4"/>
-              <w:left w:val="single" w:color="EAE6F6" w:sz="4"/>
-              <w:bottom w:val="single" w:color="EAE6F6" w:sz="4"/>
-              <w:right w:val="single" w:color="EAE6F6" w:sz="4"/>
-            </w:tcBorders>
-            <w:shd w:fill="FAFAFC" w:color="auto" w:val="clear"/>
-            <w:tcMar>
-              <w:top w:type="dxa" w:w="100"/>
-              <w:left w:type="dxa" w:w="120"/>
-              <w:bottom w:type="dxa" w:w="100"/>
-              <w:right w:type="dxa" w:w="120"/>
-            </w:tcMar>
-            <w:vAlign w:val="top"/>
-          </w:tcPr>
+              <w:t xml:space="preserve">Guiar el disseny de l'experiment a la fitxa: què investiguem, què fem variar (la sal), què mesurem (la massa), quin got és el control i què deixem igual.</w:t>
+            </w:r>
+          </w:p>
           <w:p>
             <w:pPr>
               <w:spacing w:after="60" w:before="0" w:line="264"/>
@@ -8418,9 +8602,56 @@
                 <w:sz w:val="20"/>
                 <w:szCs w:val="20"/>
               </w:rPr>
-              <w:t xml:space="preserve">Mesuren l'ou, anoten el valor inicial a la taula i el submergeixen.</w:t>
-            </w:r>
-          </w:p>
+              <w:t xml:space="preserve">Tancar la fase amb tots els ous dins </w:t>
+            </w:r>
+            <w:r>
+              <w:rPr>
+                <w:rFonts w:ascii="Fira Sans Extra Condensed" w:cs="Fira Sans Extra Condensed" w:eastAsia="Fira Sans Extra Condensed" w:hAnsi="Fira Sans Extra Condensed"/>
+                <w:b/>
+                <w:bCs/>
+                <w:i w:val="false"/>
+                <w:iCs w:val="false"/>
+                <w:caps w:val="false"/>
+                <w:color w:val="4A3F3F"/>
+                <w:sz w:val="20"/>
+                <w:szCs w:val="20"/>
+              </w:rPr>
+              <w:t xml:space="preserve">abans del minut 30</w:t>
+            </w:r>
+            <w:r>
+              <w:rPr>
+                <w:rFonts w:ascii="Fira Sans Extra Condensed" w:cs="Fira Sans Extra Condensed" w:eastAsia="Fira Sans Extra Condensed" w:hAnsi="Fira Sans Extra Condensed"/>
+                <w:b w:val="false"/>
+                <w:bCs w:val="false"/>
+                <w:i w:val="false"/>
+                <w:iCs w:val="false"/>
+                <w:caps w:val="false"/>
+                <w:color w:val="4A3F3F"/>
+                <w:sz w:val="20"/>
+                <w:szCs w:val="20"/>
+              </w:rPr>
+              <w:t xml:space="preserve">. Encara no es dibuixen resultats ni s'escriuen conclusions.</w:t>
+            </w:r>
+          </w:p>
+        </w:tc>
+        <w:tc>
+          <w:tcPr>
+            <w:tcW w:type="dxa" w:w="3466"/>
+            <w:tcBorders>
+              <w:top w:val="single" w:color="EAE6F6" w:sz="4"/>
+              <w:left w:val="single" w:color="EAE6F6" w:sz="4"/>
+              <w:bottom w:val="single" w:color="EAE6F6" w:sz="4"/>
+              <w:right w:val="single" w:color="EAE6F6" w:sz="4"/>
+            </w:tcBorders>
+            <w:shd w:fill="FAFAFC" w:color="auto" w:val="clear"/>
+            <w:tcMar>
+              <w:top w:type="dxa" w:w="100"/>
+              <w:left w:type="dxa" w:w="120"/>
+              <w:bottom w:type="dxa" w:w="100"/>
+              <w:right w:type="dxa" w:w="120"/>
+            </w:tcMar>
+            <w:vAlign w:val="top"/>
+          </w:tcPr>
           <w:p>
             <w:pPr>
               <w:spacing w:after="60" w:before="0" w:line="264"/>
@@ -8453,12 +8684,12 @@
                 <w:sz w:val="20"/>
                 <w:szCs w:val="20"/>
               </w:rPr>
-              <w:t xml:space="preserve">Mentre esperen, fan l'aplicació d'osmosi amb la pregunta guia.</w:t>
-            </w:r>
-          </w:p>
-          <w:p>
-            <w:pPr>
-              <w:spacing w:after="0" w:before="0" w:line="264"/>
+              <w:t xml:space="preserve">Eixuguen i pesen l'ou, anoten la massa inicial a la taula de l'apartat 1 i el submergeixen.</w:t>
+            </w:r>
+          </w:p>
+          <w:p>
+            <w:pPr>
+              <w:spacing w:after="60" w:before="0" w:line="264"/>
               <w:ind w:left="200" w:hanging="200"/>
               <w:jc w:val="left"/>
             </w:pPr>
@@ -8488,7 +8719,42 @@
                 <w:sz w:val="20"/>
                 <w:szCs w:val="20"/>
               </w:rPr>
-              <w:t xml:space="preserve">Discuteixen en veu alta la qüestió de la mida de la mostra i dels controls.</w:t>
+              <w:t xml:space="preserve">Completen el disseny de l'experiment.</w:t>
+            </w:r>
+          </w:p>
+          <w:p>
+            <w:pPr>
+              <w:spacing w:after="60" w:before="0" w:line="264"/>
+              <w:ind w:left="200" w:hanging="200"/>
+              <w:jc w:val="left"/>
+            </w:pPr>
+            <w:r>
+              <w:rPr>
+                <w:rFonts w:ascii="Fira Sans Extra Condensed" w:cs="Fira Sans Extra Condensed" w:eastAsia="Fira Sans Extra Condensed" w:hAnsi="Fira Sans Extra Condensed"/>
+                <w:b/>
+                <w:bCs/>
+                <w:i w:val="false"/>
+                <w:iCs w:val="false"/>
+                <w:caps w:val="false"/>
+                <w:color w:val="7B68C8"/>
+                <w:sz w:val="20"/>
+                <w:szCs w:val="20"/>
+              </w:rPr>
+              <w:t xml:space="preserve">• </w:t>
+            </w:r>
+            <w:r>
+              <w:rPr>
+                <w:rFonts w:ascii="Fira Sans Extra Condensed" w:cs="Fira Sans Extra Condensed" w:eastAsia="Fira Sans Extra Condensed" w:hAnsi="Fira Sans Extra Condensed"/>
+                <w:b w:val="false"/>
+                <w:bCs w:val="false"/>
+                <w:i w:val="false"/>
+                <w:iCs w:val="false"/>
+                <w:caps w:val="false"/>
+                <w:color w:val="4A3F3F"/>
+                <w:sz w:val="20"/>
+                <w:szCs w:val="20"/>
+              </w:rPr>
+              <w:t xml:space="preserve">Si els queda temps, dibuixen l'ou ABANS.</w:t>
             </w:r>
           </w:p>
         </w:tc>
@@ -8551,7 +8817,7 @@
                 <w:sz w:val="19"/>
                 <w:szCs w:val="19"/>
               </w:rPr>
-              <w:t xml:space="preserve">25 min</w:t>
+              <w:t xml:space="preserve">30 min</w:t>
             </w:r>
           </w:p>
         </w:tc>
@@ -8595,16 +8861,30 @@
             <w:r>
               <w:rPr>
                 <w:rFonts w:ascii="Fira Sans Extra Condensed" w:cs="Fira Sans Extra Condensed" w:eastAsia="Fira Sans Extra Condensed" w:hAnsi="Fira Sans Extra Condensed"/>
-                <w:b w:val="false"/>
-                <w:bCs w:val="false"/>
-                <w:i w:val="false"/>
-                <w:iCs w:val="false"/>
-                <w:caps w:val="false"/>
-                <w:color w:val="4A3F3F"/>
-                <w:sz w:val="20"/>
-                <w:szCs w:val="20"/>
-              </w:rPr>
-              <w:t xml:space="preserve">La membrana és semipermeable: deixa passar l'aigua, però no tot.</w:t>
+                <w:b/>
+                <w:bCs/>
+                <w:i w:val="false"/>
+                <w:iCs w:val="false"/>
+                <w:caps w:val="false"/>
+                <w:color w:val="4A3F3F"/>
+                <w:sz w:val="20"/>
+                <w:szCs w:val="20"/>
+              </w:rPr>
+              <w:t xml:space="preserve">Aplicació d'osmosi guiada pel docent</w:t>
+            </w:r>
+            <w:r>
+              <w:rPr>
+                <w:rFonts w:ascii="Fira Sans Extra Condensed" w:cs="Fira Sans Extra Condensed" w:eastAsia="Fira Sans Extra Condensed" w:hAnsi="Fira Sans Extra Condensed"/>
+                <w:b w:val="false"/>
+                <w:bCs w:val="false"/>
+                <w:i w:val="false"/>
+                <w:iCs w:val="false"/>
+                <w:caps w:val="false"/>
+                <w:color w:val="4A3F3F"/>
+                <w:sz w:val="20"/>
+                <w:szCs w:val="20"/>
+              </w:rPr>
+              <w:t xml:space="preserve">, al projector i no per descobriment: abans de cada pas, pregunta de predicció «cap a on anirà l'aigua i per què?». Mentrestant, els ous esperen.</w:t>
             </w:r>
           </w:p>
           <w:p>
@@ -8639,7 +8919,7 @@
                 <w:sz w:val="20"/>
                 <w:szCs w:val="20"/>
               </w:rPr>
-              <w:t xml:space="preserve">Osmosi: l'aigua es mou cap on hi ha més solut. Per això l'ou s'infla en aigua pura i s'arruga en aigua molt salada.</w:t>
+              <w:t xml:space="preserve">La membrana és semipermeable: deixa passar l'aigua, però no fàcilment la sal.</w:t>
             </w:r>
           </w:p>
           <w:p>
@@ -8674,7 +8954,7 @@
                 <w:sz w:val="20"/>
                 <w:szCs w:val="20"/>
               </w:rPr>
-              <w:t xml:space="preserve">Difusió, en una frase: les substàncies van de més concentrat a menys concentrat.</w:t>
+              <w:t xml:space="preserve">Regla de l'osmosi: l'aigua va cap on hi ha més sal. Frase per completar de l'apartat 2 i pregunta pont: «quin ou creieu que guanyarà massa?».</w:t>
             </w:r>
           </w:p>
           <w:p>
@@ -8709,9 +8989,27 @@
                 <w:sz w:val="20"/>
                 <w:szCs w:val="20"/>
               </w:rPr>
-              <w:t xml:space="preserve">Casos reals: la diàlisi renal, la planta regada amb massa adob i el sèrum fisiològic (es diu fisiològic perquè té la mateixa concentració que les cèl·lules i no les fa ni inflar ni encongir).</w:t>
-            </w:r>
-          </w:p>
+              <w:t xml:space="preserve">Presentació de NotebookLM, part A, que no mostra cap resultat. El vocabulari hipotònic, isotònic i hipertònic només es treballa amb la fitxa A.</w:t>
+            </w:r>
+          </w:p>
+        </w:tc>
+        <w:tc>
+          <w:tcPr>
+            <w:tcW w:type="dxa" w:w="3466"/>
+            <w:tcBorders>
+              <w:top w:val="single" w:color="EAE6F6" w:sz="4"/>
+              <w:left w:val="single" w:color="EAE6F6" w:sz="4"/>
+              <w:bottom w:val="single" w:color="EAE6F6" w:sz="4"/>
+              <w:right w:val="single" w:color="EAE6F6" w:sz="4"/>
+            </w:tcBorders>
+            <w:tcMar>
+              <w:top w:type="dxa" w:w="100"/>
+              <w:left w:type="dxa" w:w="120"/>
+              <w:bottom w:type="dxa" w:w="100"/>
+              <w:right w:type="dxa" w:w="120"/>
+            </w:tcMar>
+            <w:vAlign w:val="top"/>
+          </w:tcPr>
           <w:p>
             <w:pPr>
               <w:spacing w:after="60" w:before="0" w:line="264"/>
@@ -8744,62 +9042,9 @@
                 <w:sz w:val="20"/>
                 <w:szCs w:val="20"/>
               </w:rPr>
-              <w:t xml:space="preserve">Enllaç cap endavant: «aquest mateix intercanvi el retrobareu als pulmons i als ronyons quan fem el cos humà».</w:t>
-            </w:r>
-          </w:p>
-          <w:p>
-            <w:pPr>
-              <w:spacing w:after="0" w:before="0" w:line="264"/>
-              <w:ind w:left="200" w:hanging="200"/>
-              <w:jc w:val="left"/>
-            </w:pPr>
-            <w:r>
-              <w:rPr>
-                <w:rFonts w:ascii="Fira Sans Extra Condensed" w:cs="Fira Sans Extra Condensed" w:eastAsia="Fira Sans Extra Condensed" w:hAnsi="Fira Sans Extra Condensed"/>
-                <w:b/>
-                <w:bCs/>
-                <w:i w:val="false"/>
-                <w:iCs w:val="false"/>
-                <w:caps w:val="false"/>
-                <w:color w:val="7B68C8"/>
-                <w:sz w:val="20"/>
-                <w:szCs w:val="20"/>
-              </w:rPr>
-              <w:t xml:space="preserve">• </w:t>
-            </w:r>
-            <w:r>
-              <w:rPr>
-                <w:rFonts w:ascii="Fira Sans Extra Condensed" w:cs="Fira Sans Extra Condensed" w:eastAsia="Fira Sans Extra Condensed" w:hAnsi="Fira Sans Extra Condensed"/>
-                <w:b w:val="false"/>
-                <w:bCs w:val="false"/>
-                <w:i w:val="false"/>
-                <w:iCs w:val="false"/>
-                <w:caps w:val="false"/>
-                <w:color w:val="4A3F3F"/>
-                <w:sz w:val="20"/>
-                <w:szCs w:val="20"/>
-              </w:rPr>
-              <w:t xml:space="preserve">El vocabulari hipotònic, isotònic i hipertònic només es treballa amb la fitxa A.</w:t>
-            </w:r>
-          </w:p>
-        </w:tc>
-        <w:tc>
-          <w:tcPr>
-            <w:tcW w:type="dxa" w:w="3466"/>
-            <w:tcBorders>
-              <w:top w:val="single" w:color="EAE6F6" w:sz="4"/>
-              <w:left w:val="single" w:color="EAE6F6" w:sz="4"/>
-              <w:bottom w:val="single" w:color="EAE6F6" w:sz="4"/>
-              <w:right w:val="single" w:color="EAE6F6" w:sz="4"/>
-            </w:tcBorders>
-            <w:tcMar>
-              <w:top w:type="dxa" w:w="100"/>
-              <w:left w:type="dxa" w:w="120"/>
-              <w:bottom w:type="dxa" w:w="100"/>
-              <w:right w:type="dxa" w:w="120"/>
-            </w:tcMar>
-            <w:vAlign w:val="top"/>
-          </w:tcPr>
+              <w:t xml:space="preserve">Segueixen l'aplicació i responen les preguntes de predicció.</w:t>
+            </w:r>
+          </w:p>
           <w:p>
             <w:pPr>
               <w:spacing w:after="60" w:before="0" w:line="264"/>
@@ -8832,12 +9077,12 @@
                 <w:sz w:val="20"/>
                 <w:szCs w:val="20"/>
               </w:rPr>
-              <w:t xml:space="preserve">Relacionen el que veuen als gots amb la idea d'osmosi.</w:t>
-            </w:r>
-          </w:p>
-          <w:p>
-            <w:pPr>
-              <w:spacing w:after="0" w:before="0" w:line="264"/>
+              <w:t xml:space="preserve">Omplen l'apartat 2: la regla i la frase per completar.</w:t>
+            </w:r>
+          </w:p>
+          <w:p>
+            <w:pPr>
+              <w:spacing w:after="60" w:before="0" w:line="264"/>
               <w:ind w:left="200" w:hanging="200"/>
               <w:jc w:val="left"/>
             </w:pPr>
@@ -8867,7 +9112,7 @@
                 <w:sz w:val="20"/>
                 <w:szCs w:val="20"/>
               </w:rPr>
-              <w:t xml:space="preserve">Anoten els tres casos reals a la fitxa.</w:t>
+              <w:t xml:space="preserve">Revisen la seva predicció inicial a la llum de la regla.</w:t>
             </w:r>
           </w:p>
         </w:tc>
@@ -8931,7 +9176,7 @@
                 <w:sz w:val="19"/>
                 <w:szCs w:val="19"/>
               </w:rPr>
-              <w:t xml:space="preserve">20 min</w:t>
+              <w:t xml:space="preserve">40 min</w:t>
             </w:r>
           </w:p>
         </w:tc>
@@ -8976,100 +9221,32 @@
             <w:r>
               <w:rPr>
                 <w:rFonts w:ascii="Fira Sans Extra Condensed" w:cs="Fira Sans Extra Condensed" w:eastAsia="Fira Sans Extra Condensed" w:hAnsi="Fira Sans Extra Condensed"/>
-                <w:b w:val="false"/>
-                <w:bCs w:val="false"/>
-                <w:i w:val="false"/>
-                <w:iCs w:val="false"/>
-                <w:caps w:val="false"/>
-                <w:color w:val="4A3F3F"/>
-                <w:sz w:val="20"/>
-                <w:szCs w:val="20"/>
-              </w:rPr>
-              <w:t xml:space="preserve">Fer la </w:t>
-            </w:r>
-            <w:r>
-              <w:rPr>
-                <w:rFonts w:ascii="Fira Sans Extra Condensed" w:cs="Fira Sans Extra Condensed" w:eastAsia="Fira Sans Extra Condensed" w:hAnsi="Fira Sans Extra Condensed"/>
-                <w:b/>
-                <w:bCs/>
-                <w:i w:val="false"/>
-                <w:iCs w:val="false"/>
-                <w:caps w:val="false"/>
-                <w:color w:val="4A3F3F"/>
-                <w:sz w:val="20"/>
-                <w:szCs w:val="20"/>
-              </w:rPr>
-              <w:t xml:space="preserve">mesura final</w:t>
-            </w:r>
-            <w:r>
-              <w:rPr>
-                <w:rFonts w:ascii="Fira Sans Extra Condensed" w:cs="Fira Sans Extra Condensed" w:eastAsia="Fira Sans Extra Condensed" w:hAnsi="Fira Sans Extra Condensed"/>
-                <w:b w:val="false"/>
-                <w:bCs w:val="false"/>
-                <w:i w:val="false"/>
-                <w:iCs w:val="false"/>
-                <w:caps w:val="false"/>
-                <w:color w:val="4A3F3F"/>
-                <w:sz w:val="20"/>
-                <w:szCs w:val="20"/>
-              </w:rPr>
-              <w:t xml:space="preserve"> dels ous amb la mateixa balança i registrar-la a la taula, al costat de la inicial.</w:t>
-            </w:r>
-          </w:p>
-          <w:p>
-            <w:pPr>
-              <w:spacing w:after="0" w:before="0" w:line="264"/>
-              <w:ind w:left="200" w:hanging="200"/>
-              <w:jc w:val="left"/>
-            </w:pPr>
-            <w:r>
-              <w:rPr>
-                <w:rFonts w:ascii="Fira Sans Extra Condensed" w:cs="Fira Sans Extra Condensed" w:eastAsia="Fira Sans Extra Condensed" w:hAnsi="Fira Sans Extra Condensed"/>
-                <w:b/>
-                <w:bCs/>
-                <w:i w:val="false"/>
-                <w:iCs w:val="false"/>
-                <w:caps w:val="false"/>
-                <w:color w:val="7B68C8"/>
-                <w:sz w:val="20"/>
-                <w:szCs w:val="20"/>
-              </w:rPr>
-              <w:t xml:space="preserve">• </w:t>
-            </w:r>
-            <w:r>
-              <w:rPr>
-                <w:rFonts w:ascii="Fira Sans Extra Condensed" w:cs="Fira Sans Extra Condensed" w:eastAsia="Fira Sans Extra Condensed" w:hAnsi="Fira Sans Extra Condensed"/>
-                <w:b w:val="false"/>
-                <w:bCs w:val="false"/>
-                <w:i w:val="false"/>
-                <w:iCs w:val="false"/>
-                <w:caps w:val="false"/>
-                <w:color w:val="4A3F3F"/>
-                <w:sz w:val="20"/>
-                <w:szCs w:val="20"/>
-              </w:rPr>
-              <w:t xml:space="preserve">Repartir les preguntes de transferència de la fitxa: per què una planta es marceix amb massa adob? Per què el sèrum es diu fisiològic?</w:t>
-            </w:r>
-          </w:p>
-        </w:tc>
-        <w:tc>
-          <w:tcPr>
-            <w:tcW w:type="dxa" w:w="3466"/>
-            <w:tcBorders>
-              <w:top w:val="single" w:color="EAE6F6" w:sz="4"/>
-              <w:left w:val="single" w:color="EAE6F6" w:sz="4"/>
-              <w:bottom w:val="single" w:color="EAE6F6" w:sz="4"/>
-              <w:right w:val="single" w:color="EAE6F6" w:sz="4"/>
-            </w:tcBorders>
-            <w:shd w:fill="FAFAFC" w:color="auto" w:val="clear"/>
-            <w:tcMar>
-              <w:top w:type="dxa" w:w="100"/>
-              <w:left w:type="dxa" w:w="120"/>
-              <w:bottom w:type="dxa" w:w="100"/>
-              <w:right w:type="dxa" w:w="120"/>
-            </w:tcMar>
-            <w:vAlign w:val="top"/>
-          </w:tcPr>
+                <w:b/>
+                <w:bCs/>
+                <w:i w:val="false"/>
+                <w:iCs w:val="false"/>
+                <w:caps w:val="false"/>
+                <w:color w:val="4A3F3F"/>
+                <w:sz w:val="20"/>
+                <w:szCs w:val="20"/>
+              </w:rPr>
+              <w:t xml:space="preserve">Lectura de resultats (25 min):</w:t>
+            </w:r>
+            <w:r>
+              <w:rPr>
+                <w:rFonts w:ascii="Fira Sans Extra Condensed" w:cs="Fira Sans Extra Condensed" w:eastAsia="Fira Sans Extra Condensed" w:hAnsi="Fira Sans Extra Condensed"/>
+                <w:b w:val="false"/>
+                <w:bCs w:val="false"/>
+                <w:i w:val="false"/>
+                <w:iCs w:val="false"/>
+                <w:caps w:val="false"/>
+                <w:color w:val="4A3F3F"/>
+                <w:sz w:val="20"/>
+                <w:szCs w:val="20"/>
+              </w:rPr>
+              <w:t xml:space="preserve"> treure, eixugar i pesar cada ou amb la mateixa balança. A la pissarra: diferència = massa final − massa inicial (negativa si l'ou disminueix).</w:t>
+            </w:r>
+          </w:p>
           <w:p>
             <w:pPr>
               <w:spacing w:after="60" w:before="0" w:line="264"/>
@@ -9102,12 +9279,40 @@
                 <w:sz w:val="20"/>
                 <w:szCs w:val="20"/>
               </w:rPr>
-              <w:t xml:space="preserve">Tornen a pesar l'ou, calculen la diferència i decideixen si ha guanyat o perdut aigua.</w:t>
-            </w:r>
-          </w:p>
-          <w:p>
-            <w:pPr>
-              <w:spacing w:after="0" w:before="0" w:line="264"/>
+              <w:t xml:space="preserve">Recollir a la pissarra la diferència de tots els ous i calcular la mitjana per got: moment «com es fa ciència». Guiar l'explicació </w:t>
+            </w:r>
+            <w:r>
+              <w:rPr>
+                <w:rFonts w:ascii="Fira Sans Extra Condensed" w:cs="Fira Sans Extra Condensed" w:eastAsia="Fira Sans Extra Condensed" w:hAnsi="Fira Sans Extra Condensed"/>
+                <w:b/>
+                <w:bCs/>
+                <w:i w:val="false"/>
+                <w:iCs w:val="false"/>
+                <w:caps w:val="false"/>
+                <w:color w:val="4A3F3F"/>
+                <w:sz w:val="20"/>
+                <w:szCs w:val="20"/>
+              </w:rPr>
+              <w:t xml:space="preserve">AER</w:t>
+            </w:r>
+            <w:r>
+              <w:rPr>
+                <w:rFonts w:ascii="Fira Sans Extra Condensed" w:cs="Fira Sans Extra Condensed" w:eastAsia="Fira Sans Extra Condensed" w:hAnsi="Fira Sans Extra Condensed"/>
+                <w:b w:val="false"/>
+                <w:bCs w:val="false"/>
+                <w:i w:val="false"/>
+                <w:iCs w:val="false"/>
+                <w:caps w:val="false"/>
+                <w:color w:val="4A3F3F"/>
+                <w:sz w:val="20"/>
+                <w:szCs w:val="20"/>
+              </w:rPr>
+              <w:t xml:space="preserve"> amb aquestes dades.</w:t>
+            </w:r>
+          </w:p>
+          <w:p>
+            <w:pPr>
+              <w:spacing w:after="60" w:before="0" w:line="264"/>
               <w:ind w:left="200" w:hanging="200"/>
               <w:jc w:val="left"/>
             </w:pPr>
@@ -9137,7 +9342,208 @@
                 <w:sz w:val="20"/>
                 <w:szCs w:val="20"/>
               </w:rPr>
-              <w:t xml:space="preserve">Responen les preguntes de transferència.</w:t>
+              <w:t xml:space="preserve">Qui no ha portat l'ou fa el </w:t>
+            </w:r>
+            <w:r>
+              <w:rPr>
+                <w:rFonts w:ascii="Fira Sans Extra Condensed" w:cs="Fira Sans Extra Condensed" w:eastAsia="Fira Sans Extra Condensed" w:hAnsi="Fira Sans Extra Condensed"/>
+                <w:b/>
+                <w:bCs/>
+                <w:i w:val="false"/>
+                <w:iCs w:val="false"/>
+                <w:caps w:val="false"/>
+                <w:color w:val="4A3F3F"/>
+                <w:sz w:val="20"/>
+                <w:szCs w:val="20"/>
+              </w:rPr>
+              <w:t xml:space="preserve">laboratori virtual</w:t>
+            </w:r>
+            <w:r>
+              <w:rPr>
+                <w:rFonts w:ascii="Fira Sans Extra Condensed" w:cs="Fira Sans Extra Condensed" w:eastAsia="Fira Sans Extra Condensed" w:hAnsi="Fira Sans Extra Condensed"/>
+                <w:b w:val="false"/>
+                <w:bCs w:val="false"/>
+                <w:i w:val="false"/>
+                <w:iCs w:val="false"/>
+                <w:caps w:val="false"/>
+                <w:color w:val="4A3F3F"/>
+                <w:sz w:val="20"/>
+                <w:szCs w:val="20"/>
+              </w:rPr>
+              <w:t xml:space="preserve"> (apartat 3 de la pàgina de la sessió) i en copia les dades a la fitxa.</w:t>
+            </w:r>
+          </w:p>
+          <w:p>
+            <w:pPr>
+              <w:spacing w:after="60" w:before="0" w:line="264"/>
+              <w:ind w:left="200" w:hanging="200"/>
+              <w:jc w:val="left"/>
+            </w:pPr>
+            <w:r>
+              <w:rPr>
+                <w:rFonts w:ascii="Fira Sans Extra Condensed" w:cs="Fira Sans Extra Condensed" w:eastAsia="Fira Sans Extra Condensed" w:hAnsi="Fira Sans Extra Condensed"/>
+                <w:b/>
+                <w:bCs/>
+                <w:i w:val="false"/>
+                <w:iCs w:val="false"/>
+                <w:caps w:val="false"/>
+                <w:color w:val="7B68C8"/>
+                <w:sz w:val="20"/>
+                <w:szCs w:val="20"/>
+              </w:rPr>
+              <w:t xml:space="preserve">• </w:t>
+            </w:r>
+            <w:r>
+              <w:rPr>
+                <w:rFonts w:ascii="Fira Sans Extra Condensed" w:cs="Fira Sans Extra Condensed" w:eastAsia="Fira Sans Extra Condensed" w:hAnsi="Fira Sans Extra Condensed"/>
+                <w:b/>
+                <w:bCs/>
+                <w:i w:val="false"/>
+                <w:iCs w:val="false"/>
+                <w:caps w:val="false"/>
+                <w:color w:val="4A3F3F"/>
+                <w:sz w:val="20"/>
+                <w:szCs w:val="20"/>
+              </w:rPr>
+              <w:t xml:space="preserve">Casos reals (15 min):</w:t>
+            </w:r>
+            <w:r>
+              <w:rPr>
+                <w:rFonts w:ascii="Fira Sans Extra Condensed" w:cs="Fira Sans Extra Condensed" w:eastAsia="Fira Sans Extra Condensed" w:hAnsi="Fira Sans Extra Condensed"/>
+                <w:b w:val="false"/>
+                <w:bCs w:val="false"/>
+                <w:i w:val="false"/>
+                <w:iCs w:val="false"/>
+                <w:caps w:val="false"/>
+                <w:color w:val="4A3F3F"/>
+                <w:sz w:val="20"/>
+                <w:szCs w:val="20"/>
+              </w:rPr>
+              <w:t xml:space="preserve"> diàlisi renal, planta regada amb massa adob i sèrum fisiològic (presentació, part B). Enllaç cap endavant: pulmons i ronyons al cos humà.</w:t>
+            </w:r>
+          </w:p>
+        </w:tc>
+        <w:tc>
+          <w:tcPr>
+            <w:tcW w:type="dxa" w:w="3466"/>
+            <w:tcBorders>
+              <w:top w:val="single" w:color="EAE6F6" w:sz="4"/>
+              <w:left w:val="single" w:color="EAE6F6" w:sz="4"/>
+              <w:bottom w:val="single" w:color="EAE6F6" w:sz="4"/>
+              <w:right w:val="single" w:color="EAE6F6" w:sz="4"/>
+            </w:tcBorders>
+            <w:shd w:fill="FAFAFC" w:color="auto" w:val="clear"/>
+            <w:tcMar>
+              <w:top w:type="dxa" w:w="100"/>
+              <w:left w:type="dxa" w:w="120"/>
+              <w:bottom w:type="dxa" w:w="100"/>
+              <w:right w:type="dxa" w:w="120"/>
+            </w:tcMar>
+            <w:vAlign w:val="top"/>
+          </w:tcPr>
+          <w:p>
+            <w:pPr>
+              <w:spacing w:after="60" w:before="0" w:line="264"/>
+              <w:ind w:left="200" w:hanging="200"/>
+              <w:jc w:val="left"/>
+            </w:pPr>
+            <w:r>
+              <w:rPr>
+                <w:rFonts w:ascii="Fira Sans Extra Condensed" w:cs="Fira Sans Extra Condensed" w:eastAsia="Fira Sans Extra Condensed" w:hAnsi="Fira Sans Extra Condensed"/>
+                <w:b/>
+                <w:bCs/>
+                <w:i w:val="false"/>
+                <w:iCs w:val="false"/>
+                <w:caps w:val="false"/>
+                <w:color w:val="7B68C8"/>
+                <w:sz w:val="20"/>
+                <w:szCs w:val="20"/>
+              </w:rPr>
+              <w:t xml:space="preserve">• </w:t>
+            </w:r>
+            <w:r>
+              <w:rPr>
+                <w:rFonts w:ascii="Fira Sans Extra Condensed" w:cs="Fira Sans Extra Condensed" w:eastAsia="Fira Sans Extra Condensed" w:hAnsi="Fira Sans Extra Condensed"/>
+                <w:b w:val="false"/>
+                <w:bCs w:val="false"/>
+                <w:i w:val="false"/>
+                <w:iCs w:val="false"/>
+                <w:caps w:val="false"/>
+                <w:color w:val="4A3F3F"/>
+                <w:sz w:val="20"/>
+                <w:szCs w:val="20"/>
+              </w:rPr>
+              <w:t xml:space="preserve">Pesen l'ou, calculen la diferència amb el signe i dibuixen l'ou DESPRÉS.</w:t>
+            </w:r>
+          </w:p>
+          <w:p>
+            <w:pPr>
+              <w:spacing w:after="60" w:before="0" w:line="264"/>
+              <w:ind w:left="200" w:hanging="200"/>
+              <w:jc w:val="left"/>
+            </w:pPr>
+            <w:r>
+              <w:rPr>
+                <w:rFonts w:ascii="Fira Sans Extra Condensed" w:cs="Fira Sans Extra Condensed" w:eastAsia="Fira Sans Extra Condensed" w:hAnsi="Fira Sans Extra Condensed"/>
+                <w:b/>
+                <w:bCs/>
+                <w:i w:val="false"/>
+                <w:iCs w:val="false"/>
+                <w:caps w:val="false"/>
+                <w:color w:val="7B68C8"/>
+                <w:sz w:val="20"/>
+                <w:szCs w:val="20"/>
+              </w:rPr>
+              <w:t xml:space="preserve">• </w:t>
+            </w:r>
+            <w:r>
+              <w:rPr>
+                <w:rFonts w:ascii="Fira Sans Extra Condensed" w:cs="Fira Sans Extra Condensed" w:eastAsia="Fira Sans Extra Condensed" w:hAnsi="Fira Sans Extra Condensed"/>
+                <w:b w:val="false"/>
+                <w:bCs w:val="false"/>
+                <w:i w:val="false"/>
+                <w:iCs w:val="false"/>
+                <w:caps w:val="false"/>
+                <w:color w:val="4A3F3F"/>
+                <w:sz w:val="20"/>
+                <w:szCs w:val="20"/>
+              </w:rPr>
+              <w:t xml:space="preserve">Aporten les seves dades a la taula de la classe i escriuen l'explicació AER.</w:t>
+            </w:r>
+          </w:p>
+          <w:p>
+            <w:pPr>
+              <w:spacing w:after="60" w:before="0" w:line="264"/>
+              <w:ind w:left="200" w:hanging="200"/>
+              <w:jc w:val="left"/>
+            </w:pPr>
+            <w:r>
+              <w:rPr>
+                <w:rFonts w:ascii="Fira Sans Extra Condensed" w:cs="Fira Sans Extra Condensed" w:eastAsia="Fira Sans Extra Condensed" w:hAnsi="Fira Sans Extra Condensed"/>
+                <w:b/>
+                <w:bCs/>
+                <w:i w:val="false"/>
+                <w:iCs w:val="false"/>
+                <w:caps w:val="false"/>
+                <w:color w:val="7B68C8"/>
+                <w:sz w:val="20"/>
+                <w:szCs w:val="20"/>
+              </w:rPr>
+              <w:t xml:space="preserve">• </w:t>
+            </w:r>
+            <w:r>
+              <w:rPr>
+                <w:rFonts w:ascii="Fira Sans Extra Condensed" w:cs="Fira Sans Extra Condensed" w:eastAsia="Fira Sans Extra Condensed" w:hAnsi="Fira Sans Extra Condensed"/>
+                <w:b w:val="false"/>
+                <w:bCs w:val="false"/>
+                <w:i w:val="false"/>
+                <w:iCs w:val="false"/>
+                <w:caps w:val="false"/>
+                <w:color w:val="4A3F3F"/>
+                <w:sz w:val="20"/>
+                <w:szCs w:val="20"/>
+              </w:rPr>
+              <w:t xml:space="preserve">Responen els casos reals de l'apartat 4.</w:t>
             </w:r>
           </w:p>
         </w:tc>
@@ -9200,7 +9606,7 @@
                 <w:sz w:val="19"/>
                 <w:szCs w:val="19"/>
               </w:rPr>
-              <w:t xml:space="preserve">10 min</w:t>
+              <w:t xml:space="preserve">15 min</w:t>
             </w:r>
           </w:p>
         </w:tc>
@@ -9253,7 +9659,35 @@
                 <w:sz w:val="20"/>
                 <w:szCs w:val="20"/>
               </w:rPr>
-              <w:t xml:space="preserve">Passar el formulari de Google de la S2 (osmosi i transferència).</w:t>
+              <w:t xml:space="preserve">Repartir l'</w:t>
+            </w:r>
+            <w:r>
+              <w:rPr>
+                <w:rFonts w:ascii="Fira Sans Extra Condensed" w:cs="Fira Sans Extra Condensed" w:eastAsia="Fira Sans Extra Condensed" w:hAnsi="Fira Sans Extra Condensed"/>
+                <w:b/>
+                <w:bCs/>
+                <w:i w:val="false"/>
+                <w:iCs w:val="false"/>
+                <w:caps w:val="false"/>
+                <w:color w:val="4A3F3F"/>
+                <w:sz w:val="20"/>
+                <w:szCs w:val="20"/>
+              </w:rPr>
+              <w:t xml:space="preserve">exit tiquet</w:t>
+            </w:r>
+            <w:r>
+              <w:rPr>
+                <w:rFonts w:ascii="Fira Sans Extra Condensed" w:cs="Fira Sans Extra Condensed" w:eastAsia="Fira Sans Extra Condensed" w:hAnsi="Fira Sans Extra Condensed"/>
+                <w:b w:val="false"/>
+                <w:bCs w:val="false"/>
+                <w:i w:val="false"/>
+                <w:iCs w:val="false"/>
+                <w:caps w:val="false"/>
+                <w:color w:val="4A3F3F"/>
+                <w:sz w:val="20"/>
+                <w:szCs w:val="20"/>
+              </w:rPr>
+              <w:t xml:space="preserve"> en paper (full a part; versió C per a qui la necessiti) i recollir-lo en sortir.</w:t>
             </w:r>
           </w:p>
           <w:p>
@@ -9288,62 +9722,9 @@
                 <w:sz w:val="20"/>
                 <w:szCs w:val="20"/>
               </w:rPr>
-              <w:t xml:space="preserve">Dirigir la metacognició i confirmar l'entrega de la representació dels nivells d'organització.</w:t>
-            </w:r>
-          </w:p>
-          <w:p>
-            <w:pPr>
-              <w:spacing w:after="0" w:before="0" w:line="264"/>
-              <w:ind w:left="200" w:hanging="200"/>
-              <w:jc w:val="left"/>
-            </w:pPr>
-            <w:r>
-              <w:rPr>
-                <w:rFonts w:ascii="Fira Sans Extra Condensed" w:cs="Fira Sans Extra Condensed" w:eastAsia="Fira Sans Extra Condensed" w:hAnsi="Fira Sans Extra Condensed"/>
-                <w:b/>
-                <w:bCs/>
-                <w:i w:val="false"/>
-                <w:iCs w:val="false"/>
-                <w:caps w:val="false"/>
-                <w:color w:val="7B68C8"/>
-                <w:sz w:val="20"/>
-                <w:szCs w:val="20"/>
-              </w:rPr>
-              <w:t xml:space="preserve">• </w:t>
-            </w:r>
-            <w:r>
-              <w:rPr>
-                <w:rFonts w:ascii="Fira Sans Extra Condensed" w:cs="Fira Sans Extra Condensed" w:eastAsia="Fira Sans Extra Condensed" w:hAnsi="Fira Sans Extra Condensed"/>
-                <w:b w:val="false"/>
-                <w:bCs w:val="false"/>
-                <w:i w:val="false"/>
-                <w:iCs w:val="false"/>
-                <w:caps w:val="false"/>
-                <w:color w:val="4A3F3F"/>
-                <w:sz w:val="20"/>
-                <w:szCs w:val="20"/>
-              </w:rPr>
-              <w:t xml:space="preserve">Recollir els gots i llençar els ous.</w:t>
-            </w:r>
-          </w:p>
-        </w:tc>
-        <w:tc>
-          <w:tcPr>
-            <w:tcW w:type="dxa" w:w="3466"/>
-            <w:tcBorders>
-              <w:top w:val="single" w:color="EAE6F6" w:sz="4"/>
-              <w:left w:val="single" w:color="EAE6F6" w:sz="4"/>
-              <w:bottom w:val="single" w:color="EAE6F6" w:sz="4"/>
-              <w:right w:val="single" w:color="EAE6F6" w:sz="4"/>
-            </w:tcBorders>
-            <w:tcMar>
-              <w:top w:type="dxa" w:w="100"/>
-              <w:left w:type="dxa" w:w="120"/>
-              <w:bottom w:type="dxa" w:w="100"/>
-              <w:right w:type="dxa" w:w="120"/>
-            </w:tcMar>
-            <w:vAlign w:val="top"/>
-          </w:tcPr>
+              <w:t xml:space="preserve">Dirigir la metacognició amb els objectius de la fitxa i confirmar l'entrega de la maqueta dels nivells d'organització.</w:t>
+            </w:r>
+          </w:p>
           <w:p>
             <w:pPr>
               <w:spacing w:after="60" w:before="0" w:line="264"/>
@@ -9376,12 +9757,30 @@
                 <w:sz w:val="20"/>
                 <w:szCs w:val="20"/>
               </w:rPr>
-              <w:t xml:space="preserve">Responen el formulari i fan la metacognició.</w:t>
-            </w:r>
-          </w:p>
-          <w:p>
-            <w:pPr>
-              <w:spacing w:after="0" w:before="0" w:line="264"/>
+              <w:t xml:space="preserve">Recollir els gots i llençar els ous.</w:t>
+            </w:r>
+          </w:p>
+        </w:tc>
+        <w:tc>
+          <w:tcPr>
+            <w:tcW w:type="dxa" w:w="3466"/>
+            <w:tcBorders>
+              <w:top w:val="single" w:color="EAE6F6" w:sz="4"/>
+              <w:left w:val="single" w:color="EAE6F6" w:sz="4"/>
+              <w:bottom w:val="single" w:color="EAE6F6" w:sz="4"/>
+              <w:right w:val="single" w:color="EAE6F6" w:sz="4"/>
+            </w:tcBorders>
+            <w:tcMar>
+              <w:top w:type="dxa" w:w="100"/>
+              <w:left w:type="dxa" w:w="120"/>
+              <w:bottom w:type="dxa" w:w="100"/>
+              <w:right w:type="dxa" w:w="120"/>
+            </w:tcMar>
+            <w:vAlign w:val="top"/>
+          </w:tcPr>
+          <w:p>
+            <w:pPr>
+              <w:spacing w:after="60" w:before="0" w:line="264"/>
               <w:ind w:left="200" w:hanging="200"/>
               <w:jc w:val="left"/>
             </w:pPr>
@@ -9411,7 +9810,42 @@
                 <w:sz w:val="20"/>
                 <w:szCs w:val="20"/>
               </w:rPr>
-              <w:t xml:space="preserve">Entreguen la representació dels nivells d'organització.</w:t>
+              <w:t xml:space="preserve">Fan l'exit tiquet i la metacognició.</w:t>
+            </w:r>
+          </w:p>
+          <w:p>
+            <w:pPr>
+              <w:spacing w:after="60" w:before="0" w:line="264"/>
+              <w:ind w:left="200" w:hanging="200"/>
+              <w:jc w:val="left"/>
+            </w:pPr>
+            <w:r>
+              <w:rPr>
+                <w:rFonts w:ascii="Fira Sans Extra Condensed" w:cs="Fira Sans Extra Condensed" w:eastAsia="Fira Sans Extra Condensed" w:hAnsi="Fira Sans Extra Condensed"/>
+                <w:b/>
+                <w:bCs/>
+                <w:i w:val="false"/>
+                <w:iCs w:val="false"/>
+                <w:caps w:val="false"/>
+                <w:color w:val="7B68C8"/>
+                <w:sz w:val="20"/>
+                <w:szCs w:val="20"/>
+              </w:rPr>
+              <w:t xml:space="preserve">• </w:t>
+            </w:r>
+            <w:r>
+              <w:rPr>
+                <w:rFonts w:ascii="Fira Sans Extra Condensed" w:cs="Fira Sans Extra Condensed" w:eastAsia="Fira Sans Extra Condensed" w:hAnsi="Fira Sans Extra Condensed"/>
+                <w:b w:val="false"/>
+                <w:bCs w:val="false"/>
+                <w:i w:val="false"/>
+                <w:iCs w:val="false"/>
+                <w:caps w:val="false"/>
+                <w:color w:val="4A3F3F"/>
+                <w:sz w:val="20"/>
+                <w:szCs w:val="20"/>
+              </w:rPr>
+              <w:t xml:space="preserve">Entreguen la maqueta dels nivells d'organització.</w:t>
             </w:r>
           </w:p>
         </w:tc>
@@ -9508,7 +9942,7 @@
                 <w:sz w:val="21"/>
                 <w:szCs w:val="21"/>
               </w:rPr>
-              <w:t xml:space="preserve">Abans de començar: </w:t>
+              <w:t xml:space="preserve">Abans de començar:</w:t>
             </w:r>
             <w:r>
               <w:rPr>
@@ -9522,7 +9956,7 @@
                 <w:sz w:val="21"/>
                 <w:szCs w:val="21"/>
               </w:rPr>
-              <w:t xml:space="preserve">la codocent porta la logística —gots etiquetats, sal, balances i ous de reserva— mentre el docent principal condueix el ganxo.</w:t>
+              <w:t xml:space="preserve"> la codocent prepara la logística —gots etiquetats, sal, vinagre, balances, ous de reserva i ous testimoni— mentre el docent principal condueix el ganxo.</w:t>
             </w:r>
           </w:p>
           <w:p>
@@ -9557,7 +9991,7 @@
                 <w:sz w:val="21"/>
                 <w:szCs w:val="21"/>
               </w:rPr>
-              <w:t xml:space="preserve">Explore: </w:t>
+              <w:t xml:space="preserve">Explore:</w:t>
             </w:r>
             <w:r>
               <w:rPr>
@@ -9571,12 +10005,12 @@
                 <w:sz w:val="21"/>
                 <w:szCs w:val="21"/>
               </w:rPr>
-              <w:t xml:space="preserve">una condueix l'aplicació d'osmosi al projector i l'altra passa grup per grup comprovant que la mesura inicial està anotada abans de submergir.</w:t>
-            </w:r>
-          </w:p>
-          <w:p>
-            <w:pPr>
-              <w:spacing w:after="0" w:before="0" w:line="264"/>
+              <w:t xml:space="preserve"> una passa grup per grup comprovant que la massa inicial està anotada abans de submergir; l'altra guia el disseny de l'experiment.</w:t>
+            </w:r>
+          </w:p>
+          <w:p>
+            <w:pPr>
+              <w:spacing w:after="60" w:before="0" w:line="264"/>
               <w:ind w:left="200" w:hanging="200"/>
               <w:jc w:val="left"/>
             </w:pPr>
@@ -9606,7 +10040,7 @@
                 <w:sz w:val="21"/>
                 <w:szCs w:val="21"/>
               </w:rPr>
-              <w:t xml:space="preserve">Evaluate: </w:t>
+              <w:t xml:space="preserve">Explain i Elaborate:</w:t>
             </w:r>
             <w:r>
               <w:rPr>
@@ -9620,7 +10054,56 @@
                 <w:sz w:val="21"/>
                 <w:szCs w:val="21"/>
               </w:rPr>
-              <w:t xml:space="preserve">una recull les representacions dels nivells i les registra; l'altra tanca la metacognició.</w:t>
+              <w:t xml:space="preserve"> una condueix l'aplicació d'osmosi i, després, la taula de dades de la classe a la pissarra; l'altra acompanya la pesada final i l'alumnat que fa el laboratori virtual.</w:t>
+            </w:r>
+          </w:p>
+          <w:p>
+            <w:pPr>
+              <w:spacing w:after="60" w:before="0" w:line="264"/>
+              <w:ind w:left="200" w:hanging="200"/>
+              <w:jc w:val="left"/>
+            </w:pPr>
+            <w:r>
+              <w:rPr>
+                <w:rFonts w:ascii="Fira Sans Extra Condensed" w:cs="Fira Sans Extra Condensed" w:eastAsia="Fira Sans Extra Condensed" w:hAnsi="Fira Sans Extra Condensed"/>
+                <w:b/>
+                <w:bCs/>
+                <w:i w:val="false"/>
+                <w:iCs w:val="false"/>
+                <w:caps w:val="false"/>
+                <w:color w:val="7B68C8"/>
+                <w:sz w:val="21"/>
+                <w:szCs w:val="21"/>
+              </w:rPr>
+              <w:t xml:space="preserve">• </w:t>
+            </w:r>
+            <w:r>
+              <w:rPr>
+                <w:rFonts w:ascii="Fira Sans Extra Condensed" w:cs="Fira Sans Extra Condensed" w:eastAsia="Fira Sans Extra Condensed" w:hAnsi="Fira Sans Extra Condensed"/>
+                <w:b/>
+                <w:bCs/>
+                <w:i w:val="false"/>
+                <w:iCs w:val="false"/>
+                <w:caps w:val="false"/>
+                <w:color w:val="4A3F3F"/>
+                <w:sz w:val="21"/>
+                <w:szCs w:val="21"/>
+              </w:rPr>
+              <w:t xml:space="preserve">Evaluate:</w:t>
+            </w:r>
+            <w:r>
+              <w:rPr>
+                <w:rFonts w:ascii="Fira Sans Extra Condensed" w:cs="Fira Sans Extra Condensed" w:eastAsia="Fira Sans Extra Condensed" w:hAnsi="Fira Sans Extra Condensed"/>
+                <w:b w:val="false"/>
+                <w:bCs w:val="false"/>
+                <w:i w:val="false"/>
+                <w:iCs w:val="false"/>
+                <w:caps w:val="false"/>
+                <w:color w:val="4A3F3F"/>
+                <w:sz w:val="21"/>
+                <w:szCs w:val="21"/>
+              </w:rPr>
+              <w:t xml:space="preserve"> una recull les maquetes i les registra; l'altra reparteix l'exit tiquet i tanca la metacognició.</w:t>
             </w:r>
           </w:p>
         </w:tc>
@@ -9716,7 +10199,7 @@
                 <w:sz w:val="21"/>
                 <w:szCs w:val="21"/>
               </w:rPr>
-              <w:t xml:space="preserve">«amb els vint o vint-i-cinc ous de tota la classe, ho podríem publicar? Quina mida de mostra i quins controls caldrien per estar segurs del resultat?». Serveix per veure per què la ciència real treballa amb mostres grans i grups de control.</w:t>
+              <w:t xml:space="preserve">«amb un sol ou, ho podríem afirmar? I amb els vint o vint-i-cinc ous de la classe? Per què hi posem un got de vinagre?». Es fa a l'Elaborate, amb les dades reals a la pissarra: serveix per veure per què la ciència treballa amb rèpliques, mitjanes i grups de control.</w:t>
             </w:r>
           </w:p>
         </w:tc>
@@ -9813,7 +10296,7 @@
                 <w:sz w:val="21"/>
                 <w:szCs w:val="21"/>
               </w:rPr>
-              <w:t xml:space="preserve">Invertir l'ordre: l'ou es revisa i es mesura primer; l'aplicació és per a l'estona d'espera, no l'activitat principal.</w:t>
+              <w:t xml:space="preserve">Fer dibuixar l'ou o escriure conclusions abans de treure'l: els resultats es llegeixen a l'Elaborate.</w:t>
             </w:r>
           </w:p>
           <w:p>
@@ -9848,7 +10331,7 @@
                 <w:sz w:val="21"/>
                 <w:szCs w:val="21"/>
               </w:rPr>
-              <w:t xml:space="preserve">Deixar l'aplicació en exploració lliure sense pregunta guia.</w:t>
+              <w:t xml:space="preserve">Deixar l'aplicació d'osmosi en exploració lliure: en dues hores no hi ha temps de descobrir l'osmosi; es fa guiada.</w:t>
             </w:r>
           </w:p>
           <w:p>
@@ -9883,12 +10366,12 @@
                 <w:sz w:val="21"/>
                 <w:szCs w:val="21"/>
               </w:rPr>
-              <w:t xml:space="preserve">Deixar la mesura final per a un altre dia: el resultat es llegeix avui, al final de la sessió.</w:t>
-            </w:r>
-          </w:p>
-          <w:p>
-            <w:pPr>
-              <w:spacing w:after="0" w:before="0" w:line="264"/>
+              <w:t xml:space="preserve">Oblidar la massa inicial o calcular la diferència al revés: sempre massa final − massa inicial, amb el signe.</w:t>
+            </w:r>
+          </w:p>
+          <w:p>
+            <w:pPr>
+              <w:spacing w:after="60" w:before="0" w:line="264"/>
               <w:ind w:left="200" w:hanging="200"/>
               <w:jc w:val="left"/>
             </w:pPr>
@@ -10081,7 +10564,7 @@
                 <w:sz w:val="20"/>
                 <w:szCs w:val="20"/>
               </w:rPr>
-              <w:t xml:space="preserve">Ous descalcificats de l'alumnat i dos o tres de reserva.</w:t>
+              <w:t xml:space="preserve">Ous descalcificats de l'alumnat, dos o tres de reserva i un joc d'ous testimoni.</w:t>
             </w:r>
           </w:p>
           <w:p>
@@ -10116,7 +10599,7 @@
                 <w:sz w:val="20"/>
                 <w:szCs w:val="20"/>
               </w:rPr>
-              <w:t xml:space="preserve">Dos gots per grup, aigua, sal i balança o regle.</w:t>
+              <w:t xml:space="preserve">Tres gots per grup, aigua destil·lada, sal, vinagre, balança i paper de cuina.</w:t>
             </w:r>
           </w:p>
           <w:p>
@@ -10151,7 +10634,7 @@
                 <w:sz w:val="20"/>
                 <w:szCs w:val="20"/>
               </w:rPr>
-              <w:t xml:space="preserve">Fitxa de la sessió 2, versions A, B i C.</w:t>
+              <w:t xml:space="preserve">Fitxa de la sessió 2 (versions A, B i C) i exit tiquet en full a part.</w:t>
             </w:r>
           </w:p>
           <w:p>
@@ -10186,7 +10669,7 @@
                 <w:sz w:val="20"/>
                 <w:szCs w:val="20"/>
               </w:rPr>
-              <w:t xml:space="preserve">Aplicació interactiva d'osmosi.</w:t>
+              <w:t xml:space="preserve">Aplicació d'osmosi i laboratori virtual de l'ou (pàgina de la sessió 2).</w:t>
             </w:r>
           </w:p>
           <w:p>
@@ -10226,7 +10709,7 @@
           </w:p>
           <w:p>
             <w:pPr>
-              <w:spacing w:after="0" w:before="0" w:line="264"/>
+              <w:spacing w:after="60" w:before="0" w:line="264"/>
               <w:ind w:left="200" w:hanging="200"/>
               <w:jc w:val="left"/>
             </w:pPr>
@@ -10256,7 +10739,7 @@
                 <w:sz w:val="20"/>
                 <w:szCs w:val="20"/>
               </w:rPr>
-              <w:t xml:space="preserve">Formulari de Google de la S2.</w:t>
+              <w:t xml:space="preserve">Formulari autocorrectiu de la sessió 2, penjat a Classroom com a repàs (no ocupa temps de classe).</w:t>
             </w:r>
           </w:p>
         </w:tc>
@@ -10309,26 +10792,26 @@
                 <w:sz w:val="20"/>
                 <w:szCs w:val="20"/>
               </w:rPr>
-              <w:t xml:space="preserve">Lectura de preparació: </w:t>
-            </w:r>
-            <w:r>
-              <w:rPr>
-                <w:rFonts w:ascii="Fira Sans Extra Condensed" w:cs="Fira Sans Extra Condensed" w:eastAsia="Fira Sans Extra Condensed" w:hAnsi="Fira Sans Extra Condensed"/>
-                <w:b w:val="false"/>
-                <w:bCs w:val="false"/>
-                <w:i w:val="false"/>
-                <w:iCs w:val="false"/>
-                <w:caps w:val="false"/>
-                <w:color w:val="4A3F3F"/>
-                <w:sz w:val="20"/>
-                <w:szCs w:val="20"/>
-              </w:rPr>
-              <w:t xml:space="preserve">llegir el text curt sobre per què el cos fabrica cèl·lules noves, publicat a Classroom, i subratllar dues coses que sorprenguin. Es comenten a l'inici de la S3.</w:t>
-            </w:r>
-          </w:p>
-          <w:p>
-            <w:pPr>
-              <w:spacing w:after="0" w:before="0" w:line="264"/>
+              <w:t xml:space="preserve">Lectura de preparació:</w:t>
+            </w:r>
+            <w:r>
+              <w:rPr>
+                <w:rFonts w:ascii="Fira Sans Extra Condensed" w:cs="Fira Sans Extra Condensed" w:eastAsia="Fira Sans Extra Condensed" w:hAnsi="Fira Sans Extra Condensed"/>
+                <w:b w:val="false"/>
+                <w:bCs w:val="false"/>
+                <w:i w:val="false"/>
+                <w:iCs w:val="false"/>
+                <w:caps w:val="false"/>
+                <w:color w:val="4A3F3F"/>
+                <w:sz w:val="20"/>
+                <w:szCs w:val="20"/>
+              </w:rPr>
+              <w:t xml:space="preserve"> llegir el text curt sobre per què el cos fabrica cèl·lules noves i com es divideixen (mitosi), en versió A/B o C. És a l'apartat de deures de la sessió 2 de la web i a Classroom. La comprensió es comprova amb un formulari curt a l'inici de la S3.</w:t>
+            </w:r>
+          </w:p>
+          <w:p>
+            <w:pPr>
+              <w:spacing w:after="60" w:before="0" w:line="264"/>
               <w:ind w:left="260" w:hanging="260"/>
               <w:jc w:val="left"/>
             </w:pPr>
@@ -10358,21 +10841,70 @@
                 <w:sz w:val="20"/>
                 <w:szCs w:val="20"/>
               </w:rPr>
-              <w:t xml:space="preserve">Observació a casa: </w:t>
-            </w:r>
-            <w:r>
-              <w:rPr>
-                <w:rFonts w:ascii="Fira Sans Extra Condensed" w:cs="Fira Sans Extra Condensed" w:eastAsia="Fira Sans Extra Condensed" w:hAnsi="Fira Sans Extra Condensed"/>
-                <w:b w:val="false"/>
-                <w:bCs w:val="false"/>
-                <w:i w:val="false"/>
-                <w:iCs w:val="false"/>
-                <w:caps w:val="false"/>
-                <w:color w:val="4A3F3F"/>
-                <w:sz w:val="20"/>
-                <w:szCs w:val="20"/>
-              </w:rPr>
-              <w:t xml:space="preserve">deixar un tros de pastanaga o d'api en un got amb molta sal una estona i anotar en una frase si passa el mateix que a l'ou.</w:t>
+              <w:t xml:space="preserve">Vídeo de la maqueta:</w:t>
+            </w:r>
+            <w:r>
+              <w:rPr>
+                <w:rFonts w:ascii="Fira Sans Extra Condensed" w:cs="Fira Sans Extra Condensed" w:eastAsia="Fira Sans Extra Condensed" w:hAnsi="Fira Sans Extra Condensed"/>
+                <w:b w:val="false"/>
+                <w:bCs w:val="false"/>
+                <w:i w:val="false"/>
+                <w:iCs w:val="false"/>
+                <w:caps w:val="false"/>
+                <w:color w:val="4A3F3F"/>
+                <w:sz w:val="20"/>
+                <w:szCs w:val="20"/>
+              </w:rPr>
+              <w:t xml:space="preserve"> gravar un vídeo de 2-3 minuts explicant la maqueta i els 10 nivells d'organització amb l'exemple proposat. Es puja a Classroom abans de la S3.</w:t>
+            </w:r>
+          </w:p>
+          <w:p>
+            <w:pPr>
+              <w:spacing w:after="60" w:before="0" w:line="264"/>
+              <w:ind w:left="260" w:hanging="260"/>
+              <w:jc w:val="left"/>
+            </w:pPr>
+            <w:r>
+              <w:rPr>
+                <w:rFonts w:ascii="Fira Sans Extra Condensed" w:cs="Fira Sans Extra Condensed" w:eastAsia="Fira Sans Extra Condensed" w:hAnsi="Fira Sans Extra Condensed"/>
+                <w:b/>
+                <w:bCs/>
+                <w:i w:val="false"/>
+                <w:iCs w:val="false"/>
+                <w:caps w:val="false"/>
+                <w:color w:val="7B68C8"/>
+                <w:sz w:val="20"/>
+                <w:szCs w:val="20"/>
+              </w:rPr>
+              <w:t xml:space="preserve">3 </w:t>
+            </w:r>
+            <w:r>
+              <w:rPr>
+                <w:rFonts w:ascii="Fira Sans Extra Condensed" w:cs="Fira Sans Extra Condensed" w:eastAsia="Fira Sans Extra Condensed" w:hAnsi="Fira Sans Extra Condensed"/>
+                <w:b/>
+                <w:bCs/>
+                <w:i w:val="false"/>
+                <w:iCs w:val="false"/>
+                <w:caps w:val="false"/>
+                <w:color w:val="4A3F3F"/>
+                <w:sz w:val="20"/>
+                <w:szCs w:val="20"/>
+              </w:rPr>
+              <w:t xml:space="preserve">Observació a casa:</w:t>
+            </w:r>
+            <w:r>
+              <w:rPr>
+                <w:rFonts w:ascii="Fira Sans Extra Condensed" w:cs="Fira Sans Extra Condensed" w:eastAsia="Fira Sans Extra Condensed" w:hAnsi="Fira Sans Extra Condensed"/>
+                <w:b w:val="false"/>
+                <w:bCs w:val="false"/>
+                <w:i w:val="false"/>
+                <w:iCs w:val="false"/>
+                <w:caps w:val="false"/>
+                <w:color w:val="4A3F3F"/>
+                <w:sz w:val="20"/>
+                <w:szCs w:val="20"/>
+              </w:rPr>
+              <w:t xml:space="preserve"> deixar un tros de pastanaga o d'api en un got amb molta sal una estona i anotar en una frase si passa el mateix que a l'ou.</w:t>
             </w:r>
           </w:p>
         </w:tc>
@@ -10969,6 +11501,41 @@
     </w:p>
     <w:p>
       <w:pPr>
+        <w:spacing w:after="60" w:before="0" w:line="264"/>
+        <w:ind w:left="260" w:hanging="260"/>
+        <w:jc w:val="left"/>
+      </w:pPr>
+      <w:r>
+        <w:rPr>
+          <w:rFonts w:ascii="Fira Sans Extra Condensed" w:cs="Fira Sans Extra Condensed" w:eastAsia="Fira Sans Extra Condensed" w:hAnsi="Fira Sans Extra Condensed"/>
+          <w:b/>
+          <w:bCs/>
+          <w:i w:val="false"/>
+          <w:iCs w:val="false"/>
+          <w:caps w:val="false"/>
+          <w:color w:val="7B68C8"/>
+          <w:sz w:val="21"/>
+          <w:szCs w:val="21"/>
+        </w:rPr>
+        <w:t xml:space="preserve">6 </w:t>
+      </w:r>
+      <w:r>
+        <w:rPr>
+          <w:rFonts w:ascii="Fira Sans Extra Condensed" w:cs="Fira Sans Extra Condensed" w:eastAsia="Fira Sans Extra Condensed" w:hAnsi="Fira Sans Extra Condensed"/>
+          <w:b w:val="false"/>
+          <w:bCs w:val="false"/>
+          <w:i w:val="false"/>
+          <w:iCs w:val="false"/>
+          <w:caps w:val="false"/>
+          <w:color w:val="4A3F3F"/>
+          <w:sz w:val="21"/>
+          <w:szCs w:val="21"/>
+        </w:rPr>
+        <w:t xml:space="preserve">Tenir a punt els dos formularis de la lectura (A/B i C) amb l'enllaç a Classroom, i comprovar que tothom té dispositiu: es responen a l'inici de la sessió, abans del time-lapse.</w:t>
+      </w:r>
+    </w:p>
+    <w:p>
+      <w:pPr>
         <w:spacing w:after="180" w:before="0"/>
       </w:pPr>
     </w:p>
@@ -11226,7 +11793,7 @@
                 <w:sz w:val="19"/>
                 <w:szCs w:val="19"/>
               </w:rPr>
-              <w:t xml:space="preserve">10 min</w:t>
+              <w:t xml:space="preserve">15 min</w:t>
             </w:r>
           </w:p>
         </w:tc>
@@ -11279,21 +11846,21 @@
                 <w:sz w:val="20"/>
                 <w:szCs w:val="20"/>
               </w:rPr>
-              <w:t xml:space="preserve">Ganxo: </w:t>
-            </w:r>
-            <w:r>
-              <w:rPr>
-                <w:rFonts w:ascii="Fira Sans Extra Condensed" w:cs="Fira Sans Extra Condensed" w:eastAsia="Fira Sans Extra Condensed" w:hAnsi="Fira Sans Extra Condensed"/>
-                <w:b w:val="false"/>
-                <w:bCs w:val="false"/>
-                <w:i w:val="false"/>
-                <w:iCs w:val="false"/>
-                <w:caps w:val="false"/>
-                <w:color w:val="4A3F3F"/>
-                <w:sz w:val="20"/>
-                <w:szCs w:val="20"/>
-              </w:rPr>
-              <w:t xml:space="preserve">posar el time-lapse sense veu i preguntar «per què creieu que aquesta cèl·lula es divideix? Què està fabricant?».</w:t>
+              <w:t xml:space="preserve">Formulari de la lectura: </w:t>
+            </w:r>
+            <w:r>
+              <w:rPr>
+                <w:rFonts w:ascii="Fira Sans Extra Condensed" w:cs="Fira Sans Extra Condensed" w:eastAsia="Fira Sans Extra Condensed" w:hAnsi="Fira Sans Extra Condensed"/>
+                <w:b w:val="false"/>
+                <w:bCs w:val="false"/>
+                <w:i w:val="false"/>
+                <w:iCs w:val="false"/>
+                <w:caps w:val="false"/>
+                <w:color w:val="4A3F3F"/>
+                <w:sz w:val="20"/>
+                <w:szCs w:val="20"/>
+              </w:rPr>
+              <w:t xml:space="preserve">passar el formulari de Google de la lectura (versió A/B o C segons la fitxa de cada alumne): 4 preguntes, uns 5 minuts, sense mirar el text. Va abans del time-lapse perquè no es contamini l'Explore. Es deixa l'enllaç a Classroom.</w:t>
             </w:r>
           </w:p>
           <w:p>
@@ -11319,6 +11886,55 @@
             <w:r>
               <w:rPr>
                 <w:rFonts w:ascii="Fira Sans Extra Condensed" w:cs="Fira Sans Extra Condensed" w:eastAsia="Fira Sans Extra Condensed" w:hAnsi="Fira Sans Extra Condensed"/>
+                <w:b/>
+                <w:bCs/>
+                <w:i w:val="false"/>
+                <w:iCs w:val="false"/>
+                <w:caps w:val="false"/>
+                <w:color w:val="4A3F3F"/>
+                <w:sz w:val="20"/>
+                <w:szCs w:val="20"/>
+              </w:rPr>
+              <w:t xml:space="preserve">Ganxo: </w:t>
+            </w:r>
+            <w:r>
+              <w:rPr>
+                <w:rFonts w:ascii="Fira Sans Extra Condensed" w:cs="Fira Sans Extra Condensed" w:eastAsia="Fira Sans Extra Condensed" w:hAnsi="Fira Sans Extra Condensed"/>
+                <w:b w:val="false"/>
+                <w:bCs w:val="false"/>
+                <w:i w:val="false"/>
+                <w:iCs w:val="false"/>
+                <w:caps w:val="false"/>
+                <w:color w:val="4A3F3F"/>
+                <w:sz w:val="20"/>
+                <w:szCs w:val="20"/>
+              </w:rPr>
+              <w:t xml:space="preserve">posar el time-lapse sense veu i preguntar «per què creieu que aquesta cèl·lula es divideix? Què està fabricant?».</w:t>
+            </w:r>
+          </w:p>
+          <w:p>
+            <w:pPr>
+              <w:spacing w:after="60" w:before="0" w:line="264"/>
+              <w:ind w:left="200" w:hanging="200"/>
+              <w:jc w:val="left"/>
+            </w:pPr>
+            <w:r>
+              <w:rPr>
+                <w:rFonts w:ascii="Fira Sans Extra Condensed" w:cs="Fira Sans Extra Condensed" w:eastAsia="Fira Sans Extra Condensed" w:hAnsi="Fira Sans Extra Condensed"/>
+                <w:b/>
+                <w:bCs/>
+                <w:i w:val="false"/>
+                <w:iCs w:val="false"/>
+                <w:caps w:val="false"/>
+                <w:color w:val="7B68C8"/>
+                <w:sz w:val="20"/>
+                <w:szCs w:val="20"/>
+              </w:rPr>
+              <w:t xml:space="preserve">• </w:t>
+            </w:r>
+            <w:r>
+              <w:rPr>
+                <w:rFonts w:ascii="Fira Sans Extra Condensed" w:cs="Fira Sans Extra Condensed" w:eastAsia="Fira Sans Extra Condensed" w:hAnsi="Fira Sans Extra Condensed"/>
                 <w:b w:val="false"/>
                 <w:bCs w:val="false"/>
                 <w:i w:val="false"/>
@@ -11384,6 +12000,41 @@
             </w:tcMar>
             <w:vAlign w:val="top"/>
           </w:tcPr>
+          <w:p>
+            <w:pPr>
+              <w:spacing w:after="60" w:before="0" w:line="264"/>
+              <w:ind w:left="200" w:hanging="200"/>
+              <w:jc w:val="left"/>
+            </w:pPr>
+            <w:r>
+              <w:rPr>
+                <w:rFonts w:ascii="Fira Sans Extra Condensed" w:cs="Fira Sans Extra Condensed" w:eastAsia="Fira Sans Extra Condensed" w:hAnsi="Fira Sans Extra Condensed"/>
+                <w:b/>
+                <w:bCs/>
+                <w:i w:val="false"/>
+                <w:iCs w:val="false"/>
+                <w:caps w:val="false"/>
+                <w:color w:val="7B68C8"/>
+                <w:sz w:val="20"/>
+                <w:szCs w:val="20"/>
+              </w:rPr>
+              <w:t xml:space="preserve">• </w:t>
+            </w:r>
+            <w:r>
+              <w:rPr>
+                <w:rFonts w:ascii="Fira Sans Extra Condensed" w:cs="Fira Sans Extra Condensed" w:eastAsia="Fira Sans Extra Condensed" w:hAnsi="Fira Sans Extra Condensed"/>
+                <w:b w:val="false"/>
+                <w:bCs w:val="false"/>
+                <w:i w:val="false"/>
+                <w:iCs w:val="false"/>
+                <w:caps w:val="false"/>
+                <w:color w:val="4A3F3F"/>
+                <w:sz w:val="20"/>
+                <w:szCs w:val="20"/>
+              </w:rPr>
+              <w:t xml:space="preserve">Responen individualment el formulari de la lectura, sense mirar el text.</w:t>
+            </w:r>
+          </w:p>
           <w:p>
             <w:pPr>
               <w:spacing w:after="60" w:before="0" w:line="264"/>
@@ -12601,6 +13252,55 @@
                 <w:sz w:val="21"/>
                 <w:szCs w:val="21"/>
               </w:rPr>
+              <w:t xml:space="preserve">Engage: </w:t>
+            </w:r>
+            <w:r>
+              <w:rPr>
+                <w:rFonts w:ascii="Fira Sans Extra Condensed" w:cs="Fira Sans Extra Condensed" w:eastAsia="Fira Sans Extra Condensed" w:hAnsi="Fira Sans Extra Condensed"/>
+                <w:b w:val="false"/>
+                <w:bCs w:val="false"/>
+                <w:i w:val="false"/>
+                <w:iCs w:val="false"/>
+                <w:caps w:val="false"/>
+                <w:color w:val="4A3F3F"/>
+                <w:sz w:val="21"/>
+                <w:szCs w:val="21"/>
+              </w:rPr>
+              <w:t xml:space="preserve">una docent llança el formulari de la lectura i comprova que tothom el respon; l'altra prepara el time-lapse i la projecció. Les respostes obertes es revisen després de la sessió, no a classe.</w:t>
+            </w:r>
+          </w:p>
+          <w:p>
+            <w:pPr>
+              <w:spacing w:after="60" w:before="0" w:line="264"/>
+              <w:ind w:left="200" w:hanging="200"/>
+              <w:jc w:val="left"/>
+            </w:pPr>
+            <w:r>
+              <w:rPr>
+                <w:rFonts w:ascii="Fira Sans Extra Condensed" w:cs="Fira Sans Extra Condensed" w:eastAsia="Fira Sans Extra Condensed" w:hAnsi="Fira Sans Extra Condensed"/>
+                <w:b/>
+                <w:bCs/>
+                <w:i w:val="false"/>
+                <w:iCs w:val="false"/>
+                <w:caps w:val="false"/>
+                <w:color w:val="7B68C8"/>
+                <w:sz w:val="21"/>
+                <w:szCs w:val="21"/>
+              </w:rPr>
+              <w:t xml:space="preserve">• </w:t>
+            </w:r>
+            <w:r>
+              <w:rPr>
+                <w:rFonts w:ascii="Fira Sans Extra Condensed" w:cs="Fira Sans Extra Condensed" w:eastAsia="Fira Sans Extra Condensed" w:hAnsi="Fira Sans Extra Condensed"/>
+                <w:b/>
+                <w:bCs/>
+                <w:i w:val="false"/>
+                <w:iCs w:val="false"/>
+                <w:caps w:val="false"/>
+                <w:color w:val="4A3F3F"/>
+                <w:sz w:val="21"/>
+                <w:szCs w:val="21"/>
+              </w:rPr>
               <w:t xml:space="preserve">Explore: </w:t>
             </w:r>
             <w:r>
@@ -13245,6 +13945,41 @@
                 <w:szCs w:val="20"/>
               </w:rPr>
               <w:t xml:space="preserve">Fitxa de la sessió 3, versions A, B i C.</w:t>
+            </w:r>
+          </w:p>
+          <w:p>
+            <w:pPr>
+              <w:spacing w:after="60" w:before="0" w:line="264"/>
+              <w:ind w:left="200" w:hanging="200"/>
+              <w:jc w:val="left"/>
+            </w:pPr>
+            <w:r>
+              <w:rPr>
+                <w:rFonts w:ascii="Fira Sans Extra Condensed" w:cs="Fira Sans Extra Condensed" w:eastAsia="Fira Sans Extra Condensed" w:hAnsi="Fira Sans Extra Condensed"/>
+                <w:b/>
+                <w:bCs/>
+                <w:i w:val="false"/>
+                <w:iCs w:val="false"/>
+                <w:caps w:val="false"/>
+                <w:color w:val="7B68C8"/>
+                <w:sz w:val="20"/>
+                <w:szCs w:val="20"/>
+              </w:rPr>
+              <w:t xml:space="preserve">• </w:t>
+            </w:r>
+            <w:r>
+              <w:rPr>
+                <w:rFonts w:ascii="Fira Sans Extra Condensed" w:cs="Fira Sans Extra Condensed" w:eastAsia="Fira Sans Extra Condensed" w:hAnsi="Fira Sans Extra Condensed"/>
+                <w:b w:val="false"/>
+                <w:bCs w:val="false"/>
+                <w:i w:val="false"/>
+                <w:iCs w:val="false"/>
+                <w:caps w:val="false"/>
+                <w:color w:val="4A3F3F"/>
+                <w:sz w:val="20"/>
+                <w:szCs w:val="20"/>
+              </w:rPr>
+              <w:t xml:space="preserve">Formularis de Google de la lectura (versions A/B i C).</w:t>
             </w:r>
           </w:p>
           <w:p>
@@ -16869,6 +17604,125 @@
                 <w:szCs w:val="20"/>
               </w:rPr>
               <w:t xml:space="preserve">Projector i dispositius, des de la pàgina de la sessió</w:t>
+            </w:r>
+          </w:p>
+        </w:tc>
+      </w:tr>
+      <w:tr>
+        <w:trPr>
+          <w:cantSplit/>
+        </w:trPr>
+        <w:tc>
+          <w:tcPr>
+            <w:tcW w:type="dxa" w:w="4200"/>
+            <w:tcBorders>
+              <w:top w:val="single" w:color="EAE6F6" w:sz="4"/>
+              <w:left w:val="single" w:color="EAE6F6" w:sz="4"/>
+              <w:bottom w:val="single" w:color="EAE6F6" w:sz="4"/>
+              <w:right w:val="single" w:color="EAE6F6" w:sz="4"/>
+            </w:tcBorders>
+            <w:tcMar>
+              <w:top w:type="dxa" w:w="100"/>
+              <w:left w:type="dxa" w:w="120"/>
+              <w:bottom w:type="dxa" w:w="100"/>
+              <w:right w:type="dxa" w:w="120"/>
+            </w:tcMar>
+            <w:vAlign w:val="top"/>
+          </w:tcPr>
+          <w:p>
+            <w:pPr>
+              <w:spacing w:after="0" w:before="0" w:line="264"/>
+              <w:jc w:val="left"/>
+            </w:pPr>
+            <w:r>
+              <w:rPr>
+                <w:rFonts w:ascii="Fira Sans Extra Condensed" w:cs="Fira Sans Extra Condensed" w:eastAsia="Fira Sans Extra Condensed" w:hAnsi="Fira Sans Extra Condensed"/>
+                <w:b w:val="false"/>
+                <w:bCs w:val="false"/>
+                <w:i w:val="false"/>
+                <w:iCs w:val="false"/>
+                <w:caps w:val="false"/>
+                <w:color w:val="4A3F3F"/>
+                <w:sz w:val="20"/>
+                <w:szCs w:val="20"/>
+              </w:rPr>
+              <w:t xml:space="preserve">Laboratori virtual de l'ou</w:t>
+            </w:r>
+          </w:p>
+        </w:tc>
+        <w:tc>
+          <w:tcPr>
+            <w:tcW w:type="dxa" w:w="1600"/>
+            <w:tcBorders>
+              <w:top w:val="single" w:color="EAE6F6" w:sz="4"/>
+              <w:left w:val="single" w:color="EAE6F6" w:sz="4"/>
+              <w:bottom w:val="single" w:color="EAE6F6" w:sz="4"/>
+              <w:right w:val="single" w:color="EAE6F6" w:sz="4"/>
+            </w:tcBorders>
+            <w:tcMar>
+              <w:top w:type="dxa" w:w="100"/>
+              <w:left w:type="dxa" w:w="120"/>
+              <w:bottom w:type="dxa" w:w="100"/>
+              <w:right w:type="dxa" w:w="120"/>
+            </w:tcMar>
+            <w:vAlign w:val="top"/>
+          </w:tcPr>
+          <w:p>
+            <w:pPr>
+              <w:spacing w:after="0" w:before="0" w:line="264"/>
+              <w:jc w:val="left"/>
+            </w:pPr>
+            <w:r>
+              <w:rPr>
+                <w:rFonts w:ascii="Fira Sans Extra Condensed" w:cs="Fira Sans Extra Condensed" w:eastAsia="Fira Sans Extra Condensed" w:hAnsi="Fira Sans Extra Condensed"/>
+                <w:b w:val="false"/>
+                <w:bCs w:val="false"/>
+                <w:i w:val="false"/>
+                <w:iCs w:val="false"/>
+                <w:caps w:val="false"/>
+                <w:color w:val="4A3F3F"/>
+                <w:sz w:val="20"/>
+                <w:szCs w:val="20"/>
+              </w:rPr>
+              <w:t xml:space="preserve">S2</w:t>
+            </w:r>
+          </w:p>
+        </w:tc>
+        <w:tc>
+          <w:tcPr>
+            <w:tcW w:type="dxa" w:w="4066"/>
+            <w:tcBorders>
+              <w:top w:val="single" w:color="EAE6F6" w:sz="4"/>
+              <w:left w:val="single" w:color="EAE6F6" w:sz="4"/>
+              <w:bottom w:val="single" w:color="EAE6F6" w:sz="4"/>
+              <w:right w:val="single" w:color="EAE6F6" w:sz="4"/>
+            </w:tcBorders>
+            <w:tcMar>
+              <w:top w:type="dxa" w:w="100"/>
+              <w:left w:type="dxa" w:w="120"/>
+              <w:bottom w:type="dxa" w:w="100"/>
+              <w:right w:type="dxa" w:w="120"/>
+            </w:tcMar>
+            <w:vAlign w:val="top"/>
+          </w:tcPr>
+          <w:p>
+            <w:pPr>
+              <w:spacing w:after="0" w:before="0" w:line="264"/>
+              <w:jc w:val="left"/>
+            </w:pPr>
+            <w:r>
+              <w:rPr>
+                <w:rFonts w:ascii="Fira Sans Extra Condensed" w:cs="Fira Sans Extra Condensed" w:eastAsia="Fira Sans Extra Condensed" w:hAnsi="Fira Sans Extra Condensed"/>
+                <w:b w:val="false"/>
+                <w:bCs w:val="false"/>
+                <w:i w:val="false"/>
+                <w:iCs w:val="false"/>
+                <w:caps w:val="false"/>
+                <w:color w:val="4A3F3F"/>
+                <w:sz w:val="20"/>
+                <w:szCs w:val="20"/>
+              </w:rPr>
+              <w:t xml:space="preserve">Qui no porti l'ou o hagi faltat, des de la pàgina de la sessió (apartat 3 i «Has faltat a classe?»)</w:t>
             </w:r>
           </w:p>
         </w:tc>

</xml_diff>